<commit_message>
all business questions are added
</commit_message>
<xml_diff>
--- a/business_questions.docx
+++ b/business_questions.docx
@@ -1,7 +1,375 @@
 
 <file path=word/document.xml><?xml version="1.0" encoding="utf-8"?>
-<w:document xmlns:wpc="http://schemas.microsoft.com/office/word/2010/wordprocessingCanvas" xmlns:cx="http://schemas.microsoft.com/office/drawing/2014/chartex" xmlns:cx1="http://schemas.microsoft.com/office/drawing/2015/9/8/chartex" xmlns:cx2="http://schemas.microsoft.com/office/drawing/2015/10/21/chartex" xmlns:cx3="http://schemas.microsoft.com/office/drawing/2016/5/9/chartex" xmlns:cx4="http://schemas.microsoft.com/office/drawing/2016/5/10/chartex" xmlns:cx5="http://schemas.microsoft.com/office/drawing/2016/5/11/chartex" xmlns:cx6="http://schemas.microsoft.com/office/drawing/2016/5/12/chartex" xmlns:cx7="http://schemas.microsoft.com/office/drawing/2016/5/13/chartex" xmlns:cx8="http://schemas.microsoft.com/office/drawing/2016/5/14/chartex" xmlns:mc="http://schemas.openxmlformats.org/markup-compatibility/2006" xmlns:aink="http://schemas.microsoft.com/office/drawing/2016/ink" xmlns:am3d="http://schemas.microsoft.com/office/drawing/2017/model3d" xmlns:o="urn:schemas-microsoft-com:office:office" xmlns:oel="http://schemas.microsoft.com/office/2019/extlst" xmlns:r="http://schemas.openxmlformats.org/officeDocument/2006/relationships" xmlns:m="http://schemas.openxmlformats.org/officeDocument/2006/math" xmlns:v="urn:schemas-microsoft-com:vml" xmlns:wp14="http://schemas.microsoft.com/office/word/2010/wordprocessingDrawing" xmlns:wp="http://schemas.openxmlformats.org/drawingml/2006/wordprocessingDrawing" xmlns:w10="urn:schemas-microsoft-com:office:word" xmlns:w="http://schemas.openxmlformats.org/wordprocessingml/2006/main" xmlns:w14="http://schemas.microsoft.com/office/word/2010/wordml" xmlns:w15="http://schemas.microsoft.com/office/word/2012/wordml" xmlns:w16cei="http://schemas.microsoft.com/office/word/2026/wordml/cei" xmlns:w16cex="http://schemas.microsoft.com/office/word/2018/wordml/cex" xmlns:w16cid="http://schemas.microsoft.com/office/word/2016/wordml/cid" xmlns:w16="http://schemas.microsoft.com/office/word/2018/wordml" xmlns:w16du="http://schemas.microsoft.com/office/word/2023/wordml/word16du" xmlns:w16sdtdh="http://schemas.microsoft.com/office/word/2020/wordml/sdtdatahash" xmlns:w16sdtfl="http://schemas.microsoft.com/office/word/2024/wordml/sdtformatlock" xmlns:w16se="http://schemas.microsoft.com/office/word/2015/wordml/symex" xmlns:wpg="http://schemas.microsoft.com/office/word/2010/wordprocessingGroup" xmlns:wpi="http://schemas.microsoft.com/office/word/2010/wordprocessingInk" xmlns:wne="http://schemas.microsoft.com/office/word/2006/wordml" xmlns:wps="http://schemas.microsoft.com/office/word/2010/wordprocessingShape" mc:Ignorable="w14 w15 w16se w16cid w16 w16cex w16sdtdh w16sdtfl w16du wp14">
+<w:document xmlns:wpc="http://schemas.microsoft.com/office/word/2010/wordprocessingCanvas" xmlns:cx="http://schemas.microsoft.com/office/drawing/2014/chartex" xmlns:cx1="http://schemas.microsoft.com/office/drawing/2015/9/8/chartex" xmlns:cx2="http://schemas.microsoft.com/office/drawing/2015/10/21/chartex" xmlns:cx3="http://schemas.microsoft.com/office/drawing/2016/5/9/chartex" xmlns:cx4="http://schemas.microsoft.com/office/drawing/2016/5/10/chartex" xmlns:cx5="http://schemas.microsoft.com/office/drawing/2016/5/11/chartex" xmlns:cx6="http://schemas.microsoft.com/office/drawing/2016/5/12/chartex" xmlns:cx7="http://schemas.microsoft.com/office/drawing/2016/5/13/chartex" xmlns:cx8="http://schemas.microsoft.com/office/drawing/2016/5/14/chartex" xmlns:mc="http://schemas.openxmlformats.org/markup-compatibility/2006" xmlns:aink="http://schemas.microsoft.com/office/drawing/2016/ink" xmlns:am3d="http://schemas.microsoft.com/office/drawing/2017/model3d" xmlns:o="urn:schemas-microsoft-com:office:office" xmlns:r="http://schemas.openxmlformats.org/officeDocument/2006/relationships" xmlns:m="http://schemas.openxmlformats.org/officeDocument/2006/math" xmlns:v="urn:schemas-microsoft-com:vml" xmlns:wp14="http://schemas.microsoft.com/office/word/2010/wordprocessingDrawing" xmlns:wp="http://schemas.openxmlformats.org/drawingml/2006/wordprocessingDrawing" xmlns:w10="urn:schemas-microsoft-com:office:word" xmlns:w="http://schemas.openxmlformats.org/wordprocessingml/2006/main" xmlns:w14="http://schemas.microsoft.com/office/word/2010/wordml" xmlns:w15="http://schemas.microsoft.com/office/word/2012/wordml" xmlns:w16cex="http://schemas.microsoft.com/office/word/2018/wordml/cex" xmlns:w16cid="http://schemas.microsoft.com/office/word/2016/wordml/cid" xmlns:w16="http://schemas.microsoft.com/office/word/2018/wordml" xmlns:w16sdtdh="http://schemas.microsoft.com/office/word/2020/wordml/sdtdatahash" xmlns:w16se="http://schemas.microsoft.com/office/word/2015/wordml/symex" xmlns:wpg="http://schemas.microsoft.com/office/word/2010/wordprocessingGroup" xmlns:wpi="http://schemas.microsoft.com/office/word/2010/wordprocessingInk" xmlns:wne="http://schemas.microsoft.com/office/word/2006/wordml" xmlns:wps="http://schemas.microsoft.com/office/word/2010/wordprocessingShape" mc:Ignorable="w14 w15 w16se w16cid w16 w16cex w16sdtdh wp14">
   <w:body>
+    <w:p>
+      <w:pPr>
+        <w:jc w:val="center"/>
+        <w:rPr>
+          <w:b/>
+          <w:bCs/>
+          <w:sz w:val="28"/>
+          <w:szCs w:val="34"/>
+        </w:rPr>
+      </w:pPr>
+      <w:r>
+        <w:rPr>
+          <w:b/>
+          <w:bCs/>
+          <w:sz w:val="28"/>
+          <w:szCs w:val="34"/>
+        </w:rPr>
+        <w:t>Order Fulfilment - Complete Question Set</w:t>
+      </w:r>
+    </w:p>
+    <w:p>
+      <w:pPr>
+        <w:jc w:val="both"/>
+      </w:pPr>
+      <w:r>
+        <w:rPr>
+          <w:b/>
+          <w:bCs/>
+        </w:rPr>
+        <w:t>Order composition &amp; value</w:t>
+      </w:r>
+    </w:p>
+    <w:p>
+      <w:pPr>
+        <w:pStyle w:val="ListParagraph"/>
+        <w:numPr>
+          <w:ilvl w:val="0"/>
+          <w:numId w:val="3"/>
+        </w:numPr>
+        <w:jc w:val="both"/>
+      </w:pPr>
+      <w:r>
+        <w:t>How many items are in an order?</w:t>
+      </w:r>
+    </w:p>
+    <w:p>
+      <w:pPr>
+        <w:pStyle w:val="ListParagraph"/>
+        <w:numPr>
+          <w:ilvl w:val="0"/>
+          <w:numId w:val="3"/>
+        </w:numPr>
+        <w:jc w:val="both"/>
+      </w:pPr>
+      <w:r>
+        <w:t>What is the total order value (before discount)?</w:t>
+      </w:r>
+    </w:p>
+    <w:p>
+      <w:pPr>
+        <w:pStyle w:val="ListParagraph"/>
+        <w:numPr>
+          <w:ilvl w:val="0"/>
+          <w:numId w:val="3"/>
+        </w:numPr>
+        <w:jc w:val="both"/>
+      </w:pPr>
+      <w:r>
+        <w:t>How much discount did the order have?</w:t>
+      </w:r>
+    </w:p>
+    <w:p>
+      <w:pPr>
+        <w:pStyle w:val="ListParagraph"/>
+        <w:numPr>
+          <w:ilvl w:val="0"/>
+          <w:numId w:val="3"/>
+        </w:numPr>
+        <w:jc w:val="both"/>
+      </w:pPr>
+      <w:r>
+        <w:t>What was the final amount paid?</w:t>
+      </w:r>
+    </w:p>
+    <w:p>
+      <w:pPr>
+        <w:pStyle w:val="ListParagraph"/>
+        <w:numPr>
+          <w:ilvl w:val="0"/>
+          <w:numId w:val="3"/>
+        </w:numPr>
+        <w:jc w:val="both"/>
+      </w:pPr>
+      <w:r>
+        <w:t>What is the mode of payment?</w:t>
+      </w:r>
+    </w:p>
+    <w:p>
+      <w:pPr>
+        <w:jc w:val="both"/>
+      </w:pPr>
+      <w:r>
+        <w:rPr>
+          <w:b/>
+          <w:bCs/>
+        </w:rPr>
+        <w:t>Restaurant / prep stage</w:t>
+      </w:r>
+      <w:r>
+        <w:t xml:space="preserve"> </w:t>
+      </w:r>
+    </w:p>
+    <w:p>
+      <w:pPr>
+        <w:pStyle w:val="ListParagraph"/>
+        <w:numPr>
+          <w:ilvl w:val="0"/>
+          <w:numId w:val="3"/>
+        </w:numPr>
+        <w:jc w:val="both"/>
+      </w:pPr>
+      <w:r>
+        <w:t xml:space="preserve">Which restaurant/hotel did the order get assigned to? </w:t>
+      </w:r>
+    </w:p>
+    <w:p>
+      <w:pPr>
+        <w:pStyle w:val="ListParagraph"/>
+        <w:numPr>
+          <w:ilvl w:val="0"/>
+          <w:numId w:val="3"/>
+        </w:numPr>
+        <w:jc w:val="both"/>
+      </w:pPr>
+      <w:r>
+        <w:t xml:space="preserve">How much time did it take for the order to be prepared? </w:t>
+      </w:r>
+    </w:p>
+    <w:p>
+      <w:pPr>
+        <w:pStyle w:val="ListParagraph"/>
+        <w:numPr>
+          <w:ilvl w:val="0"/>
+          <w:numId w:val="3"/>
+        </w:numPr>
+        <w:jc w:val="both"/>
+      </w:pPr>
+      <w:r>
+        <w:t>Did the restaurant accept the order, or was it rejected? (</w:t>
+      </w:r>
+      <w:proofErr w:type="gramStart"/>
+      <w:r>
+        <w:t>new</w:t>
+      </w:r>
+      <w:proofErr w:type="gramEnd"/>
+      <w:r>
+        <w:t xml:space="preserve"> - you have a Cancelled path from Hotel Assigned in your state machine, meaning rejection is possible; worth a question capturing that explicitly)</w:t>
+      </w:r>
+    </w:p>
+    <w:p>
+      <w:pPr>
+        <w:jc w:val="both"/>
+        <w:rPr>
+          <w:b/>
+          <w:bCs/>
+        </w:rPr>
+      </w:pPr>
+      <w:r>
+        <w:rPr>
+          <w:b/>
+          <w:bCs/>
+        </w:rPr>
+        <w:t>Driver / delivery stage</w:t>
+      </w:r>
+    </w:p>
+    <w:p>
+      <w:pPr>
+        <w:pStyle w:val="ListParagraph"/>
+        <w:numPr>
+          <w:ilvl w:val="0"/>
+          <w:numId w:val="3"/>
+        </w:numPr>
+        <w:jc w:val="both"/>
+      </w:pPr>
+      <w:r>
+        <w:t>Which driver did the order get assigned to?</w:t>
+      </w:r>
+    </w:p>
+    <w:p>
+      <w:pPr>
+        <w:pStyle w:val="ListParagraph"/>
+        <w:numPr>
+          <w:ilvl w:val="0"/>
+          <w:numId w:val="3"/>
+        </w:numPr>
+        <w:jc w:val="both"/>
+      </w:pPr>
+      <w:r>
+        <w:t>Did the driver accept the delivery, or was it reassigned? (</w:t>
+      </w:r>
+      <w:proofErr w:type="gramStart"/>
+      <w:r>
+        <w:t>new</w:t>
+      </w:r>
+      <w:proofErr w:type="gramEnd"/>
+      <w:r>
+        <w:t xml:space="preserve"> - same reasoning: your diagram allows cancellation after Driver Assigned, meaning rejection/reassignment is a real path worth measuring)</w:t>
+      </w:r>
+    </w:p>
+    <w:p>
+      <w:pPr>
+        <w:pStyle w:val="ListParagraph"/>
+        <w:numPr>
+          <w:ilvl w:val="0"/>
+          <w:numId w:val="3"/>
+        </w:numPr>
+        <w:jc w:val="both"/>
+      </w:pPr>
+      <w:r>
+        <w:t>How much time did it take for the delivery (pickup to drop-off)?</w:t>
+      </w:r>
+    </w:p>
+    <w:p>
+      <w:pPr>
+        <w:pStyle w:val="ListParagraph"/>
+        <w:numPr>
+          <w:ilvl w:val="0"/>
+          <w:numId w:val="3"/>
+        </w:numPr>
+        <w:jc w:val="both"/>
+      </w:pPr>
+      <w:r>
+        <w:t>What was the total distance travelled for the delivery? (</w:t>
+      </w:r>
+      <w:proofErr w:type="gramStart"/>
+      <w:r>
+        <w:t>new</w:t>
+      </w:r>
+      <w:proofErr w:type="gramEnd"/>
+      <w:r>
+        <w:t xml:space="preserve"> - you'll have GPS data from driver location; distance is a natural derived metric ops teams care about - e.g. cost per km, delivery efficiency)</w:t>
+      </w:r>
+    </w:p>
+    <w:p>
+      <w:pPr>
+        <w:jc w:val="both"/>
+      </w:pPr>
+      <w:r>
+        <w:rPr>
+          <w:b/>
+          <w:bCs/>
+        </w:rPr>
+        <w:t>Outcome</w:t>
+      </w:r>
+    </w:p>
+    <w:p>
+      <w:pPr>
+        <w:pStyle w:val="ListParagraph"/>
+        <w:numPr>
+          <w:ilvl w:val="0"/>
+          <w:numId w:val="3"/>
+        </w:numPr>
+        <w:jc w:val="both"/>
+      </w:pPr>
+      <w:r>
+        <w:t>Did the customer accept the parcel? (</w:t>
+      </w:r>
+      <w:proofErr w:type="gramStart"/>
+      <w:r>
+        <w:t>kept</w:t>
+      </w:r>
+      <w:proofErr w:type="gramEnd"/>
+      <w:r>
+        <w:t xml:space="preserve"> - but flagged, needs a real state to back it)</w:t>
+      </w:r>
+    </w:p>
+    <w:p>
+      <w:pPr>
+        <w:pStyle w:val="ListParagraph"/>
+        <w:numPr>
+          <w:ilvl w:val="0"/>
+          <w:numId w:val="3"/>
+        </w:numPr>
+        <w:jc w:val="both"/>
+      </w:pPr>
+      <w:r>
+        <w:t>Did the order get cancelled? At what stage?</w:t>
+      </w:r>
+    </w:p>
+    <w:p>
+      <w:pPr>
+        <w:pStyle w:val="ListParagraph"/>
+        <w:numPr>
+          <w:ilvl w:val="0"/>
+          <w:numId w:val="3"/>
+        </w:numPr>
+        <w:jc w:val="both"/>
+      </w:pPr>
+      <w:r>
+        <w:t>What is the final order status?</w:t>
+      </w:r>
+    </w:p>
+    <w:p>
+      <w:pPr>
+        <w:pStyle w:val="ListParagraph"/>
+        <w:numPr>
+          <w:ilvl w:val="0"/>
+          <w:numId w:val="3"/>
+        </w:numPr>
+        <w:jc w:val="both"/>
+      </w:pPr>
+      <w:r>
+        <w:t>What was the total end-to-end time from order placed to delivered? (</w:t>
+      </w:r>
+      <w:proofErr w:type="gramStart"/>
+      <w:r>
+        <w:t>new</w:t>
+      </w:r>
+      <w:proofErr w:type="gramEnd"/>
+      <w:r>
+        <w:t xml:space="preserve"> - this is often the single most-reported SLA metric in delivery businesses; distinct from "prep time" and "delivery time" individually, since it's the customer-facing number)</w:t>
+      </w:r>
+    </w:p>
+    <w:p>
+      <w:pPr>
+        <w:jc w:val="center"/>
+        <w:rPr>
+          <w:b/>
+          <w:bCs/>
+        </w:rPr>
+      </w:pPr>
+    </w:p>
+    <w:p>
+      <w:pPr>
+        <w:jc w:val="center"/>
+        <w:rPr>
+          <w:b/>
+          <w:bCs/>
+        </w:rPr>
+      </w:pPr>
+    </w:p>
+    <w:p>
+      <w:pPr>
+        <w:jc w:val="center"/>
+        <w:rPr>
+          <w:b/>
+          <w:bCs/>
+        </w:rPr>
+      </w:pPr>
+    </w:p>
+    <w:p>
+      <w:pPr>
+        <w:jc w:val="center"/>
+        <w:rPr>
+          <w:b/>
+          <w:bCs/>
+        </w:rPr>
+      </w:pPr>
+    </w:p>
+    <w:p>
+      <w:pPr>
+        <w:jc w:val="center"/>
+        <w:rPr>
+          <w:b/>
+          <w:bCs/>
+        </w:rPr>
+      </w:pPr>
+    </w:p>
     <w:p>
       <w:pPr>
         <w:jc w:val="center"/>
@@ -19,451 +387,26 @@
           <w:sz w:val="26"/>
           <w:szCs w:val="32"/>
         </w:rPr>
-        <w:t>Order Fulfilment - Complete Question Set</w:t>
-      </w:r>
-    </w:p>
-    <w:p>
-      <w:pPr>
-        <w:jc w:val="both"/>
-      </w:pPr>
+        <w:lastRenderedPageBreak/>
+        <w:t xml:space="preserve">Driver Activity </w:t>
+      </w:r>
       <w:r>
         <w:rPr>
           <w:b/>
           <w:bCs/>
+          <w:sz w:val="26"/>
+          <w:szCs w:val="32"/>
         </w:rPr>
-        <w:t>Order composition &amp; value</w:t>
-      </w:r>
-    </w:p>
-    <w:p>
-      <w:pPr>
-        <w:pStyle w:val="ListParagraph"/>
-        <w:numPr>
-          <w:ilvl w:val="0"/>
-          <w:numId w:val="3"/>
-        </w:numPr>
-        <w:jc w:val="both"/>
-      </w:pPr>
-      <w:r>
-        <w:t>How many items are in an order?</w:t>
-      </w:r>
-    </w:p>
-    <w:p>
-      <w:pPr>
-        <w:pStyle w:val="ListParagraph"/>
-        <w:numPr>
-          <w:ilvl w:val="0"/>
-          <w:numId w:val="3"/>
-        </w:numPr>
-        <w:jc w:val="both"/>
-      </w:pPr>
-      <w:r>
-        <w:t>What is the total order value (before discount)?</w:t>
-      </w:r>
-    </w:p>
-    <w:p>
-      <w:pPr>
-        <w:pStyle w:val="ListParagraph"/>
-        <w:numPr>
-          <w:ilvl w:val="0"/>
-          <w:numId w:val="3"/>
-        </w:numPr>
-        <w:jc w:val="both"/>
-      </w:pPr>
-      <w:r>
-        <w:t>How much discount did the order have?</w:t>
-      </w:r>
-    </w:p>
-    <w:p>
-      <w:pPr>
-        <w:pStyle w:val="ListParagraph"/>
-        <w:numPr>
-          <w:ilvl w:val="0"/>
-          <w:numId w:val="3"/>
-        </w:numPr>
-        <w:jc w:val="both"/>
-      </w:pPr>
-      <w:r>
-        <w:t>What was the final amount paid?</w:t>
-      </w:r>
-    </w:p>
-    <w:p>
-      <w:pPr>
-        <w:pStyle w:val="ListParagraph"/>
-        <w:numPr>
-          <w:ilvl w:val="0"/>
-          <w:numId w:val="3"/>
-        </w:numPr>
-        <w:jc w:val="both"/>
-      </w:pPr>
-      <w:r>
-        <w:t>What is the mode of payment?</w:t>
-      </w:r>
-    </w:p>
-    <w:p>
-      <w:pPr>
-        <w:jc w:val="both"/>
-      </w:pPr>
+        <w:t>-</w:t>
+      </w:r>
       <w:r>
         <w:rPr>
           <w:b/>
           <w:bCs/>
+          <w:sz w:val="26"/>
+          <w:szCs w:val="32"/>
         </w:rPr>
-        <w:t>Restaurant / prep stage</w:t>
-      </w:r>
-      <w:r>
-        <w:t xml:space="preserve"> </w:t>
-      </w:r>
-    </w:p>
-    <w:p>
-      <w:pPr>
-        <w:pStyle w:val="ListParagraph"/>
-        <w:numPr>
-          <w:ilvl w:val="0"/>
-          <w:numId w:val="1"/>
-        </w:numPr>
-        <w:jc w:val="both"/>
-      </w:pPr>
-      <w:r>
-        <w:t xml:space="preserve">Which restaurant/hotel did the order get assigned to? </w:t>
-      </w:r>
-    </w:p>
-    <w:p>
-      <w:pPr>
-        <w:pStyle w:val="ListParagraph"/>
-        <w:numPr>
-          <w:ilvl w:val="0"/>
-          <w:numId w:val="1"/>
-        </w:numPr>
-        <w:jc w:val="both"/>
-      </w:pPr>
-      <w:r>
-        <w:t xml:space="preserve">How much time did it take for the order to be prepared? </w:t>
-      </w:r>
-    </w:p>
-    <w:p>
-      <w:pPr>
-        <w:pStyle w:val="ListParagraph"/>
-        <w:numPr>
-          <w:ilvl w:val="0"/>
-          <w:numId w:val="1"/>
-        </w:numPr>
-        <w:jc w:val="both"/>
-      </w:pPr>
-      <w:r>
-        <w:t xml:space="preserve">Did the restaurant accept the order, or was it rejected? </w:t>
-      </w:r>
-      <w:r>
-        <w:rPr>
-          <w:i/>
-          <w:iCs/>
-        </w:rPr>
-        <w:t xml:space="preserve">(new </w:t>
-      </w:r>
-      <w:r>
-        <w:rPr>
-          <w:i/>
-          <w:iCs/>
-        </w:rPr>
-        <w:t>-</w:t>
-      </w:r>
-      <w:r>
-        <w:rPr>
-          <w:i/>
-          <w:iCs/>
-        </w:rPr>
-        <w:t xml:space="preserve"> you have a Cancelled path from Hotel Assigned in your state machine, meaning rejection is possible; worth a question capturing that explicitly)</w:t>
-      </w:r>
-    </w:p>
-    <w:p>
-      <w:pPr>
-        <w:jc w:val="both"/>
-        <w:rPr>
-          <w:b/>
-          <w:bCs/>
-        </w:rPr>
-      </w:pPr>
-      <w:r>
-        <w:rPr>
-          <w:b/>
-          <w:bCs/>
-        </w:rPr>
-        <w:t>Driver / delivery stage</w:t>
-      </w:r>
-    </w:p>
-    <w:p>
-      <w:pPr>
-        <w:pStyle w:val="ListParagraph"/>
-        <w:numPr>
-          <w:ilvl w:val="0"/>
-          <w:numId w:val="4"/>
-        </w:numPr>
-        <w:jc w:val="both"/>
-      </w:pPr>
-      <w:r>
-        <w:t>Which driver did the order get assigned to?</w:t>
-      </w:r>
-    </w:p>
-    <w:p>
-      <w:pPr>
-        <w:pStyle w:val="ListParagraph"/>
-        <w:numPr>
-          <w:ilvl w:val="0"/>
-          <w:numId w:val="4"/>
-        </w:numPr>
-        <w:jc w:val="both"/>
-      </w:pPr>
-      <w:r>
-        <w:t xml:space="preserve">Did the driver accept the delivery, or was it reassigned? </w:t>
-      </w:r>
-      <w:r>
-        <w:rPr>
-          <w:i/>
-          <w:iCs/>
-        </w:rPr>
-        <w:t xml:space="preserve">(new </w:t>
-      </w:r>
-      <w:r>
-        <w:rPr>
-          <w:i/>
-          <w:iCs/>
-        </w:rPr>
-        <w:t>-</w:t>
-      </w:r>
-      <w:r>
-        <w:rPr>
-          <w:i/>
-          <w:iCs/>
-        </w:rPr>
-        <w:t xml:space="preserve"> same reasoning: your diagram allows cancellation after Driver Assigned, meaning rejection/reassignment is a real path worth measuring)</w:t>
-      </w:r>
-    </w:p>
-    <w:p>
-      <w:pPr>
-        <w:pStyle w:val="ListParagraph"/>
-        <w:numPr>
-          <w:ilvl w:val="0"/>
-          <w:numId w:val="4"/>
-        </w:numPr>
-        <w:jc w:val="both"/>
-      </w:pPr>
-      <w:r>
-        <w:t>How much time did it take for the delivery (pickup to drop-off)?</w:t>
-      </w:r>
-    </w:p>
-    <w:p>
-      <w:pPr>
-        <w:pStyle w:val="ListParagraph"/>
-        <w:numPr>
-          <w:ilvl w:val="0"/>
-          <w:numId w:val="4"/>
-        </w:numPr>
-        <w:jc w:val="both"/>
-      </w:pPr>
-      <w:r>
-        <w:t xml:space="preserve">What was the total distance travelled for the delivery? </w:t>
-      </w:r>
-      <w:r>
-        <w:rPr>
-          <w:i/>
-          <w:iCs/>
-        </w:rPr>
-        <w:t xml:space="preserve">(new </w:t>
-      </w:r>
-      <w:r>
-        <w:rPr>
-          <w:i/>
-          <w:iCs/>
-        </w:rPr>
-        <w:t>-</w:t>
-      </w:r>
-      <w:r>
-        <w:rPr>
-          <w:i/>
-          <w:iCs/>
-        </w:rPr>
-        <w:t xml:space="preserve"> you'll have GPS data from driver location; distance is a natural derived metric ops teams care about </w:t>
-      </w:r>
-      <w:r>
-        <w:rPr>
-          <w:i/>
-          <w:iCs/>
-        </w:rPr>
-        <w:t>-</w:t>
-      </w:r>
-      <w:r>
-        <w:rPr>
-          <w:i/>
-          <w:iCs/>
-        </w:rPr>
-        <w:t xml:space="preserve"> e.g. cost per km, delivery efficiency)</w:t>
-      </w:r>
-    </w:p>
-    <w:p>
-      <w:pPr>
-        <w:jc w:val="both"/>
-      </w:pPr>
-      <w:r>
-        <w:rPr>
-          <w:b/>
-          <w:bCs/>
-        </w:rPr>
-        <w:t>Outcome</w:t>
-      </w:r>
-    </w:p>
-    <w:p>
-      <w:pPr>
-        <w:pStyle w:val="ListParagraph"/>
-        <w:numPr>
-          <w:ilvl w:val="0"/>
-          <w:numId w:val="5"/>
-        </w:numPr>
-        <w:jc w:val="both"/>
-      </w:pPr>
-      <w:r>
-        <w:t xml:space="preserve">Did the customer accept the parcel? </w:t>
-      </w:r>
-      <w:r>
-        <w:rPr>
-          <w:i/>
-          <w:iCs/>
-        </w:rPr>
-        <w:t xml:space="preserve">(kept </w:t>
-      </w:r>
-      <w:r>
-        <w:rPr>
-          <w:i/>
-          <w:iCs/>
-        </w:rPr>
-        <w:t>-</w:t>
-      </w:r>
-      <w:r>
-        <w:rPr>
-          <w:i/>
-          <w:iCs/>
-        </w:rPr>
-        <w:t xml:space="preserve"> but flagged, needs a real state to back it)</w:t>
-      </w:r>
-    </w:p>
-    <w:p>
-      <w:pPr>
-        <w:pStyle w:val="ListParagraph"/>
-        <w:numPr>
-          <w:ilvl w:val="0"/>
-          <w:numId w:val="5"/>
-        </w:numPr>
-        <w:jc w:val="both"/>
-      </w:pPr>
-      <w:r>
-        <w:t>Did the order get cancelled? At what stage?</w:t>
-      </w:r>
-    </w:p>
-    <w:p>
-      <w:pPr>
-        <w:pStyle w:val="ListParagraph"/>
-        <w:numPr>
-          <w:ilvl w:val="0"/>
-          <w:numId w:val="5"/>
-        </w:numPr>
-        <w:jc w:val="both"/>
-      </w:pPr>
-      <w:r>
-        <w:t>What is the final order status?</w:t>
-      </w:r>
-    </w:p>
-    <w:p>
-      <w:pPr>
-        <w:pStyle w:val="ListParagraph"/>
-        <w:numPr>
-          <w:ilvl w:val="0"/>
-          <w:numId w:val="5"/>
-        </w:numPr>
-        <w:jc w:val="both"/>
-      </w:pPr>
-      <w:r>
-        <w:t xml:space="preserve">What was the total end-to-end time from order placed to delivered? </w:t>
-      </w:r>
-      <w:r>
-        <w:rPr>
-          <w:i/>
-          <w:iCs/>
-        </w:rPr>
-        <w:t xml:space="preserve">(new </w:t>
-      </w:r>
-      <w:r>
-        <w:rPr>
-          <w:i/>
-          <w:iCs/>
-        </w:rPr>
-        <w:t>-</w:t>
-      </w:r>
-      <w:r>
-        <w:rPr>
-          <w:i/>
-          <w:iCs/>
-        </w:rPr>
-        <w:t xml:space="preserve"> this is often the single most-reported SLA metric in delivery businesses; distinct from "prep time" and "delivery time" individually, since it's the customer-facing number)</w:t>
-      </w:r>
-    </w:p>
-    <w:p>
-      <w:pPr>
-        <w:jc w:val="center"/>
-        <w:rPr>
-          <w:b/>
-          <w:bCs/>
-        </w:rPr>
-      </w:pPr>
-    </w:p>
-    <w:p>
-      <w:pPr>
-        <w:jc w:val="center"/>
-        <w:rPr>
-          <w:b/>
-          <w:bCs/>
-        </w:rPr>
-      </w:pPr>
-    </w:p>
-    <w:p>
-      <w:pPr>
-        <w:jc w:val="center"/>
-        <w:rPr>
-          <w:b/>
-          <w:bCs/>
-        </w:rPr>
-      </w:pPr>
-    </w:p>
-    <w:p>
-      <w:pPr>
-        <w:jc w:val="center"/>
-        <w:rPr>
-          <w:b/>
-          <w:bCs/>
-        </w:rPr>
-      </w:pPr>
-    </w:p>
-    <w:p>
-      <w:pPr>
-        <w:jc w:val="center"/>
-        <w:rPr>
-          <w:b/>
-          <w:bCs/>
-        </w:rPr>
-      </w:pPr>
-    </w:p>
-    <w:p>
-      <w:pPr>
-        <w:jc w:val="center"/>
-        <w:rPr>
-          <w:b/>
-          <w:bCs/>
-        </w:rPr>
-      </w:pPr>
-      <w:r>
-        <w:rPr>
-          <w:b/>
-          <w:bCs/>
-        </w:rPr>
-        <w:lastRenderedPageBreak/>
-        <w:t>Driver Activity — Complete Question Set</w:t>
+        <w:t xml:space="preserve"> Complete Question Set</w:t>
       </w:r>
     </w:p>
     <w:p>
@@ -483,20 +426,12 @@
         <w:pStyle w:val="ListParagraph"/>
         <w:numPr>
           <w:ilvl w:val="0"/>
-          <w:numId w:val="7"/>
+          <w:numId w:val="18"/>
         </w:numPr>
         <w:jc w:val="both"/>
       </w:pPr>
       <w:r>
-        <w:t xml:space="preserve">Driver </w:t>
-      </w:r>
-      <w:proofErr w:type="gramStart"/>
-      <w:r>
-        <w:t>start</w:t>
-      </w:r>
-      <w:proofErr w:type="gramEnd"/>
-      <w:r>
-        <w:t xml:space="preserve"> time and end time in the app each day (kept)</w:t>
+        <w:t>Driver start time and end time in the app each day (kept)</w:t>
       </w:r>
     </w:p>
     <w:p>
@@ -504,29 +439,26 @@
         <w:pStyle w:val="ListParagraph"/>
         <w:numPr>
           <w:ilvl w:val="0"/>
-          <w:numId w:val="7"/>
+          <w:numId w:val="18"/>
         </w:numPr>
         <w:jc w:val="both"/>
       </w:pPr>
       <w:r>
-        <w:t xml:space="preserve">How much total time was the driver </w:t>
-      </w:r>
-      <w:r>
-        <w:rPr>
-          <w:i/>
-          <w:iCs/>
-        </w:rPr>
-        <w:t>active/online</w:t>
-      </w:r>
-      <w:r>
-        <w:t xml:space="preserve"> vs. just logged in but idle? </w:t>
-      </w:r>
-      <w:r>
-        <w:rPr>
-          <w:i/>
-          <w:iCs/>
-        </w:rPr>
-        <w:t>(new — "logged in 8 hours" and "actually working 8 hours" are very different numbers; utilization is usually the #1 driver-ops metric)</w:t>
+        <w:t>How much total time was the driver active/online vs. just logged in but idle? (</w:t>
+      </w:r>
+      <w:proofErr w:type="gramStart"/>
+      <w:r>
+        <w:t>new</w:t>
+      </w:r>
+      <w:proofErr w:type="gramEnd"/>
+      <w:r>
+        <w:t xml:space="preserve"> </w:t>
+      </w:r>
+      <w:r>
+        <w:t>-</w:t>
+      </w:r>
+      <w:r>
+        <w:t xml:space="preserve"> "logged in 8 hours" and "actually working 8 hours" are very different numbers; utilization is usually the #1 driver-ops metric)</w:t>
       </w:r>
     </w:p>
     <w:p>
@@ -534,19 +466,26 @@
         <w:pStyle w:val="ListParagraph"/>
         <w:numPr>
           <w:ilvl w:val="0"/>
-          <w:numId w:val="7"/>
+          <w:numId w:val="18"/>
         </w:numPr>
         <w:jc w:val="both"/>
       </w:pPr>
       <w:r>
-        <w:t xml:space="preserve">How many hours was the driver available but not assigned any order? </w:t>
-      </w:r>
-      <w:r>
-        <w:rPr>
-          <w:i/>
-          <w:iCs/>
-        </w:rPr>
-        <w:t>(new — idle time, directly measures supply/demand imbalance, ties back to your earlier "surge pricing" business question)</w:t>
+        <w:t>How many hours was the driver available but not assigned any order? (</w:t>
+      </w:r>
+      <w:proofErr w:type="gramStart"/>
+      <w:r>
+        <w:t>new</w:t>
+      </w:r>
+      <w:proofErr w:type="gramEnd"/>
+      <w:r>
+        <w:t xml:space="preserve"> </w:t>
+      </w:r>
+      <w:r>
+        <w:t>-</w:t>
+      </w:r>
+      <w:r>
+        <w:t xml:space="preserve"> idle time, directly measures supply/demand imbalance, ties back to your earlier "surge pricing" business question)</w:t>
       </w:r>
     </w:p>
     <w:p>
@@ -570,7 +509,7 @@
         <w:pStyle w:val="ListParagraph"/>
         <w:numPr>
           <w:ilvl w:val="0"/>
-          <w:numId w:val="8"/>
+          <w:numId w:val="18"/>
         </w:numPr>
         <w:jc w:val="both"/>
       </w:pPr>
@@ -583,39 +522,26 @@
         <w:pStyle w:val="ListParagraph"/>
         <w:numPr>
           <w:ilvl w:val="0"/>
-          <w:numId w:val="8"/>
+          <w:numId w:val="18"/>
         </w:numPr>
         <w:jc w:val="both"/>
       </w:pPr>
       <w:r>
-        <w:t xml:space="preserve">How many delivery requests did the driver </w:t>
-      </w:r>
-      <w:r>
-        <w:rPr>
-          <w:i/>
-          <w:iCs/>
-        </w:rPr>
-        <w:t>reject</w:t>
-      </w:r>
-      <w:r>
-        <w:t xml:space="preserve">, and how many did they </w:t>
-      </w:r>
-      <w:r>
-        <w:rPr>
-          <w:i/>
-          <w:iCs/>
-        </w:rPr>
-        <w:t>accept</w:t>
-      </w:r>
-      <w:r>
-        <w:t xml:space="preserve">? </w:t>
-      </w:r>
-      <w:r>
-        <w:rPr>
-          <w:i/>
-          <w:iCs/>
-        </w:rPr>
-        <w:t>(new — acceptance rate is a standard driver-quality metric)</w:t>
+        <w:t>How many delivery requests did the driver reject, and how many did they accept? (</w:t>
+      </w:r>
+      <w:proofErr w:type="gramStart"/>
+      <w:r>
+        <w:t>new</w:t>
+      </w:r>
+      <w:proofErr w:type="gramEnd"/>
+      <w:r>
+        <w:t xml:space="preserve"> </w:t>
+      </w:r>
+      <w:r>
+        <w:t>-</w:t>
+      </w:r>
+      <w:r>
+        <w:t xml:space="preserve"> acceptance rate is a standard driver-quality metric)</w:t>
       </w:r>
     </w:p>
     <w:p>
@@ -623,19 +549,26 @@
         <w:pStyle w:val="ListParagraph"/>
         <w:numPr>
           <w:ilvl w:val="0"/>
-          <w:numId w:val="8"/>
+          <w:numId w:val="18"/>
         </w:numPr>
         <w:jc w:val="both"/>
       </w:pPr>
       <w:r>
-        <w:t xml:space="preserve">What was the average delivery time per order for this driver? </w:t>
-      </w:r>
-      <w:r>
-        <w:rPr>
-          <w:i/>
-          <w:iCs/>
-        </w:rPr>
-        <w:t>(new — some drivers are consistently faster/slower; useful for both driver scoring and ETA-prediction quality)</w:t>
+        <w:t>What was the average delivery time per order for this driver? (</w:t>
+      </w:r>
+      <w:proofErr w:type="gramStart"/>
+      <w:r>
+        <w:t>new</w:t>
+      </w:r>
+      <w:proofErr w:type="gramEnd"/>
+      <w:r>
+        <w:t xml:space="preserve"> </w:t>
+      </w:r>
+      <w:r>
+        <w:t>-</w:t>
+      </w:r>
+      <w:r>
+        <w:t xml:space="preserve"> some drivers are consistently faster/slower; useful for both driver scoring and ETA-prediction quality)</w:t>
       </w:r>
     </w:p>
     <w:p>
@@ -643,29 +576,26 @@
         <w:pStyle w:val="ListParagraph"/>
         <w:numPr>
           <w:ilvl w:val="0"/>
-          <w:numId w:val="8"/>
+          <w:numId w:val="18"/>
         </w:numPr>
         <w:jc w:val="both"/>
       </w:pPr>
       <w:r>
-        <w:t xml:space="preserve">How many orders did the driver cancel </w:t>
-      </w:r>
-      <w:r>
-        <w:rPr>
-          <w:i/>
-          <w:iCs/>
-        </w:rPr>
-        <w:t>after</w:t>
-      </w:r>
-      <w:r>
-        <w:t xml:space="preserve"> accepting? </w:t>
-      </w:r>
-      <w:r>
-        <w:rPr>
-          <w:i/>
-          <w:iCs/>
-        </w:rPr>
-        <w:t>(new — different from customer/restaurant cancellations; a driver-side reliability signal)</w:t>
+        <w:t>How many orders did the driver cancel after accepting? (</w:t>
+      </w:r>
+      <w:proofErr w:type="gramStart"/>
+      <w:r>
+        <w:t>new</w:t>
+      </w:r>
+      <w:proofErr w:type="gramEnd"/>
+      <w:r>
+        <w:t xml:space="preserve"> </w:t>
+      </w:r>
+      <w:r>
+        <w:t>-</w:t>
+      </w:r>
+      <w:r>
+        <w:t xml:space="preserve"> different from customer/restaurant cancellations; a driver-side reliability signal)</w:t>
       </w:r>
     </w:p>
     <w:p>
@@ -685,20 +615,18 @@
         <w:pStyle w:val="ListParagraph"/>
         <w:numPr>
           <w:ilvl w:val="0"/>
-          <w:numId w:val="9"/>
+          <w:numId w:val="18"/>
         </w:numPr>
         <w:jc w:val="both"/>
       </w:pPr>
       <w:r>
-        <w:t>Driver location (</w:t>
-      </w:r>
-      <w:proofErr w:type="spellStart"/>
-      <w:r>
-        <w:t>lat</w:t>
-      </w:r>
-      <w:proofErr w:type="spellEnd"/>
-      <w:r>
-        <w:t>, long) every 3-5 sec (kept — but note: this is raw telemetry, not really a "fact" in the warehouse sense; it feeds a fact indirectly, more below)</w:t>
+        <w:t xml:space="preserve">Driver location (lat, long) every 3-5 sec (kept </w:t>
+      </w:r>
+      <w:r>
+        <w:t>-</w:t>
+      </w:r>
+      <w:r>
+        <w:t xml:space="preserve"> but note: this is raw telemetry, not really a "fact" in the warehouse sense; it feeds a fact indirectly, more below)</w:t>
       </w:r>
     </w:p>
     <w:p>
@@ -706,20 +634,18 @@
         <w:pStyle w:val="ListParagraph"/>
         <w:numPr>
           <w:ilvl w:val="0"/>
-          <w:numId w:val="9"/>
+          <w:numId w:val="18"/>
         </w:numPr>
         <w:jc w:val="both"/>
       </w:pPr>
       <w:r>
-        <w:t xml:space="preserve">Driver </w:t>
-      </w:r>
-      <w:proofErr w:type="gramStart"/>
-      <w:r>
-        <w:t>speed</w:t>
-      </w:r>
-      <w:proofErr w:type="gramEnd"/>
-      <w:r>
-        <w:t xml:space="preserve"> every 3-5 sec (kept — same note)</w:t>
+        <w:t xml:space="preserve">Driver speed every 3-5 sec (kept </w:t>
+      </w:r>
+      <w:r>
+        <w:t>-</w:t>
+      </w:r>
+      <w:r>
+        <w:t xml:space="preserve"> same note)</w:t>
       </w:r>
     </w:p>
     <w:p>
@@ -727,27 +653,32 @@
         <w:pStyle w:val="ListParagraph"/>
         <w:numPr>
           <w:ilvl w:val="0"/>
-          <w:numId w:val="9"/>
+          <w:numId w:val="18"/>
         </w:numPr>
         <w:jc w:val="both"/>
       </w:pPr>
       <w:r>
         <w:t xml:space="preserve">What was the total distance </w:t>
       </w:r>
-      <w:proofErr w:type="spellStart"/>
-      <w:r>
-        <w:t>traveled</w:t>
-      </w:r>
-      <w:proofErr w:type="spellEnd"/>
-      <w:r>
-        <w:t xml:space="preserve"> by the driver per day? </w:t>
-      </w:r>
-      <w:r>
-        <w:rPr>
-          <w:i/>
-          <w:iCs/>
-        </w:rPr>
-        <w:t>(new — derived from the raw GPS stream, this is the actual warehouse-level fact; the raw pings themselves are too granular to sit in a daily rollup)</w:t>
+      <w:r>
+        <w:t>travelled</w:t>
+      </w:r>
+      <w:r>
+        <w:t xml:space="preserve"> by the driver per day? (</w:t>
+      </w:r>
+      <w:proofErr w:type="gramStart"/>
+      <w:r>
+        <w:t>new</w:t>
+      </w:r>
+      <w:proofErr w:type="gramEnd"/>
+      <w:r>
+        <w:t xml:space="preserve"> </w:t>
+      </w:r>
+      <w:r>
+        <w:t>-</w:t>
+      </w:r>
+      <w:r>
+        <w:t xml:space="preserve"> derived from the raw GPS stream, this is the actual warehouse-level fact; the raw pings themselves are too granular to sit in a daily rollup)</w:t>
       </w:r>
     </w:p>
     <w:p>
@@ -767,7 +698,7 @@
         <w:pStyle w:val="ListParagraph"/>
         <w:numPr>
           <w:ilvl w:val="0"/>
-          <w:numId w:val="10"/>
+          <w:numId w:val="18"/>
         </w:numPr>
         <w:jc w:val="both"/>
       </w:pPr>
@@ -780,19 +711,26 @@
         <w:pStyle w:val="ListParagraph"/>
         <w:numPr>
           <w:ilvl w:val="0"/>
-          <w:numId w:val="10"/>
+          <w:numId w:val="18"/>
         </w:numPr>
         <w:jc w:val="both"/>
       </w:pPr>
       <w:r>
-        <w:t xml:space="preserve">What was the driver's total daily/weekly earnings? </w:t>
-      </w:r>
-      <w:r>
-        <w:rPr>
-          <w:i/>
-          <w:iCs/>
-        </w:rPr>
-        <w:t>(new — daily rollup version of #11, what a driver actually cares about)</w:t>
+        <w:t>What was the driver's total daily/weekly earnings? (</w:t>
+      </w:r>
+      <w:proofErr w:type="gramStart"/>
+      <w:r>
+        <w:t>new</w:t>
+      </w:r>
+      <w:proofErr w:type="gramEnd"/>
+      <w:r>
+        <w:t xml:space="preserve"> </w:t>
+      </w:r>
+      <w:r>
+        <w:t>-</w:t>
+      </w:r>
+      <w:r>
+        <w:t xml:space="preserve"> daily rollup version of #11, what a driver actually cares about)</w:t>
       </w:r>
     </w:p>
     <w:p>
@@ -812,7 +750,7 @@
         <w:pStyle w:val="ListParagraph"/>
         <w:numPr>
           <w:ilvl w:val="0"/>
-          <w:numId w:val="11"/>
+          <w:numId w:val="18"/>
         </w:numPr>
         <w:jc w:val="both"/>
       </w:pPr>
@@ -825,23 +763,401 @@
         <w:pStyle w:val="ListParagraph"/>
         <w:numPr>
           <w:ilvl w:val="0"/>
-          <w:numId w:val="11"/>
+          <w:numId w:val="18"/>
         </w:numPr>
         <w:jc w:val="both"/>
       </w:pPr>
       <w:r>
-        <w:t xml:space="preserve">What is the driver's average rating over a day/week/month? </w:t>
-      </w:r>
-      <w:r>
+        <w:t>What is the driver's average rating over a day/week/month? (</w:t>
+      </w:r>
+      <w:proofErr w:type="gramStart"/>
+      <w:r>
+        <w:t>new</w:t>
+      </w:r>
+      <w:proofErr w:type="gramEnd"/>
+      <w:r>
+        <w:t xml:space="preserve"> </w:t>
+      </w:r>
+      <w:r>
+        <w:t>-</w:t>
+      </w:r>
+      <w:r>
+        <w:t xml:space="preserve"> rollup version, useful for dashboards)</w:t>
+      </w:r>
+    </w:p>
+    <w:p>
+      <w:pPr>
+        <w:jc w:val="both"/>
+      </w:pPr>
+    </w:p>
+    <w:p>
+      <w:pPr>
+        <w:jc w:val="both"/>
+      </w:pPr>
+    </w:p>
+    <w:p>
+      <w:pPr>
+        <w:jc w:val="both"/>
+      </w:pPr>
+    </w:p>
+    <w:p>
+      <w:pPr>
+        <w:ind w:left="360"/>
+        <w:jc w:val="center"/>
         <w:rPr>
-          <w:i/>
-          <w:iCs/>
+          <w:b/>
+          <w:bCs/>
+          <w:sz w:val="26"/>
+          <w:szCs w:val="32"/>
         </w:rPr>
-        <w:t>(new — rollup version, useful for dashboards)</w:t>
-      </w:r>
-    </w:p>
-    <w:p>
-      <w:pPr>
+      </w:pPr>
+      <w:r>
+        <w:rPr>
+          <w:b/>
+          <w:bCs/>
+          <w:sz w:val="26"/>
+          <w:szCs w:val="32"/>
+        </w:rPr>
+        <w:lastRenderedPageBreak/>
+        <w:t xml:space="preserve">App/Customer Behaviour </w:t>
+      </w:r>
+      <w:r>
+        <w:rPr>
+          <w:b/>
+          <w:bCs/>
+          <w:sz w:val="26"/>
+          <w:szCs w:val="32"/>
+        </w:rPr>
+        <w:t>-</w:t>
+      </w:r>
+      <w:r>
+        <w:rPr>
+          <w:b/>
+          <w:bCs/>
+          <w:sz w:val="26"/>
+          <w:szCs w:val="32"/>
+        </w:rPr>
+        <w:t xml:space="preserve"> Complete Question Set</w:t>
+      </w:r>
+    </w:p>
+    <w:p>
+      <w:pPr>
+        <w:ind w:left="360"/>
+        <w:jc w:val="both"/>
+      </w:pPr>
+      <w:r>
+        <w:rPr>
+          <w:b/>
+          <w:bCs/>
+        </w:rPr>
+        <w:t>Session basics</w:t>
+      </w:r>
+    </w:p>
+    <w:p>
+      <w:pPr>
+        <w:pStyle w:val="ListParagraph"/>
+        <w:numPr>
+          <w:ilvl w:val="0"/>
+          <w:numId w:val="14"/>
+        </w:numPr>
+        <w:jc w:val="both"/>
+      </w:pPr>
+      <w:r>
+        <w:t xml:space="preserve">Session </w:t>
+      </w:r>
+      <w:proofErr w:type="gramStart"/>
+      <w:r>
+        <w:t>start</w:t>
+      </w:r>
+      <w:proofErr w:type="gramEnd"/>
+      <w:r>
+        <w:t xml:space="preserve"> and end time (kept)</w:t>
+      </w:r>
+    </w:p>
+    <w:p>
+      <w:pPr>
+        <w:pStyle w:val="ListParagraph"/>
+        <w:numPr>
+          <w:ilvl w:val="0"/>
+          <w:numId w:val="14"/>
+        </w:numPr>
+        <w:jc w:val="both"/>
+      </w:pPr>
+      <w:r>
+        <w:t>How many sessions per customer per day? (kept)</w:t>
+      </w:r>
+    </w:p>
+    <w:p>
+      <w:pPr>
+        <w:pStyle w:val="ListParagraph"/>
+        <w:numPr>
+          <w:ilvl w:val="0"/>
+          <w:numId w:val="14"/>
+        </w:numPr>
+        <w:jc w:val="both"/>
+      </w:pPr>
+      <w:r>
+        <w:t>What is the average session duration? (</w:t>
+      </w:r>
+      <w:proofErr w:type="gramStart"/>
+      <w:r>
+        <w:t>new</w:t>
+      </w:r>
+      <w:proofErr w:type="gramEnd"/>
+      <w:r>
+        <w:t xml:space="preserve"> </w:t>
+      </w:r>
+      <w:r>
+        <w:t>-</w:t>
+      </w:r>
+      <w:r>
+        <w:t xml:space="preserve"> rollup version of #1, a standard engagement metric)</w:t>
+      </w:r>
+    </w:p>
+    <w:p>
+      <w:pPr>
+        <w:ind w:left="360"/>
+        <w:jc w:val="both"/>
+      </w:pPr>
+      <w:r>
+        <w:rPr>
+          <w:b/>
+          <w:bCs/>
+        </w:rPr>
+        <w:t>Funnel / search &amp; cart</w:t>
+      </w:r>
+    </w:p>
+    <w:p>
+      <w:pPr>
+        <w:pStyle w:val="ListParagraph"/>
+        <w:numPr>
+          <w:ilvl w:val="0"/>
+          <w:numId w:val="14"/>
+        </w:numPr>
+        <w:jc w:val="both"/>
+      </w:pPr>
+      <w:r>
+        <w:t>What searches were made in a session? (kept)</w:t>
+      </w:r>
+    </w:p>
+    <w:p>
+      <w:pPr>
+        <w:pStyle w:val="ListParagraph"/>
+        <w:numPr>
+          <w:ilvl w:val="0"/>
+          <w:numId w:val="14"/>
+        </w:numPr>
+        <w:jc w:val="both"/>
+      </w:pPr>
+      <w:r>
+        <w:t>How many items were added to the cart in a session? (kept)</w:t>
+      </w:r>
+    </w:p>
+    <w:p>
+      <w:pPr>
+        <w:pStyle w:val="ListParagraph"/>
+        <w:numPr>
+          <w:ilvl w:val="0"/>
+          <w:numId w:val="14"/>
+        </w:numPr>
+        <w:jc w:val="both"/>
+      </w:pPr>
+      <w:r>
+        <w:t>How many items were removed from the cart before checkout? (</w:t>
+      </w:r>
+      <w:proofErr w:type="gramStart"/>
+      <w:r>
+        <w:t>new</w:t>
+      </w:r>
+      <w:proofErr w:type="gramEnd"/>
+      <w:r>
+        <w:t xml:space="preserve"> </w:t>
+      </w:r>
+      <w:r>
+        <w:t>-</w:t>
+      </w:r>
+      <w:r>
+        <w:t xml:space="preserve"> you actually captured food removed from cart back in your original event list, but it never made it into a question </w:t>
+      </w:r>
+      <w:r>
+        <w:t>-</w:t>
+      </w:r>
+      <w:r>
+        <w:t xml:space="preserve"> cart abandonment signals are valuable)</w:t>
+      </w:r>
+    </w:p>
+    <w:p>
+      <w:pPr>
+        <w:pStyle w:val="ListParagraph"/>
+        <w:numPr>
+          <w:ilvl w:val="0"/>
+          <w:numId w:val="14"/>
+        </w:numPr>
+        <w:jc w:val="both"/>
+      </w:pPr>
+      <w:r>
+        <w:t>Did the session reach checkout, even if it didn't complete payment? (</w:t>
+      </w:r>
+      <w:proofErr w:type="gramStart"/>
+      <w:r>
+        <w:t>new</w:t>
+      </w:r>
+      <w:proofErr w:type="gramEnd"/>
+      <w:r>
+        <w:t xml:space="preserve"> </w:t>
+      </w:r>
+      <w:r>
+        <w:t>-</w:t>
+      </w:r>
+      <w:r>
+        <w:t xml:space="preserve"> this is the classic funnel breakdown: search → cart → checkout → payment. Without this step, you can't tell where in the funnel people drop off, only whether they converted at the very end)</w:t>
+      </w:r>
+    </w:p>
+    <w:p>
+      <w:pPr>
+        <w:ind w:left="360"/>
+        <w:jc w:val="both"/>
+        <w:rPr>
+          <w:b/>
+          <w:bCs/>
+        </w:rPr>
+      </w:pPr>
+      <w:r>
+        <w:rPr>
+          <w:b/>
+          <w:bCs/>
+        </w:rPr>
+        <w:t>Outcome / conversion</w:t>
+      </w:r>
+    </w:p>
+    <w:p>
+      <w:pPr>
+        <w:pStyle w:val="ListParagraph"/>
+        <w:numPr>
+          <w:ilvl w:val="0"/>
+          <w:numId w:val="14"/>
+        </w:numPr>
+        <w:jc w:val="both"/>
+      </w:pPr>
+      <w:r>
+        <w:t>Did the session result in a successful order placement? (kept)</w:t>
+      </w:r>
+    </w:p>
+    <w:p>
+      <w:pPr>
+        <w:pStyle w:val="ListParagraph"/>
+        <w:numPr>
+          <w:ilvl w:val="0"/>
+          <w:numId w:val="14"/>
+        </w:numPr>
+        <w:jc w:val="both"/>
+      </w:pPr>
+      <w:r>
+        <w:t>What was the drop-off point for sessions that did not convert? (</w:t>
+      </w:r>
+      <w:proofErr w:type="gramStart"/>
+      <w:r>
+        <w:t>new</w:t>
+      </w:r>
+      <w:proofErr w:type="gramEnd"/>
+      <w:r>
+        <w:t xml:space="preserve"> </w:t>
+      </w:r>
+      <w:r>
+        <w:t>-</w:t>
+      </w:r>
+      <w:r>
+        <w:t xml:space="preserve"> directly derived from #4-7; this is genuinely the single most useful question a growth/product team would ask </w:t>
+      </w:r>
+      <w:r>
+        <w:t>-</w:t>
+      </w:r>
+      <w:r>
+        <w:t xml:space="preserve"> "where are we losing customers?" </w:t>
+      </w:r>
+      <w:r>
+        <w:t>-</w:t>
+      </w:r>
+      <w:r>
+        <w:t xml:space="preserve"> and it only becomes answerable if you track each funnel stage as a separate signal, not just the final outcome)</w:t>
+      </w:r>
+    </w:p>
+    <w:p>
+      <w:pPr>
+        <w:pStyle w:val="ListParagraph"/>
+        <w:numPr>
+          <w:ilvl w:val="0"/>
+          <w:numId w:val="14"/>
+        </w:numPr>
+        <w:jc w:val="both"/>
+      </w:pPr>
+      <w:r>
+        <w:t>How much time elapsed between session start and order placement (for converted sessions)? (</w:t>
+      </w:r>
+      <w:proofErr w:type="gramStart"/>
+      <w:r>
+        <w:t>new</w:t>
+      </w:r>
+      <w:proofErr w:type="gramEnd"/>
+      <w:r>
+        <w:t xml:space="preserve"> </w:t>
+      </w:r>
+      <w:r>
+        <w:t>-</w:t>
+      </w:r>
+      <w:r>
+        <w:t xml:space="preserve"> measures friction; a fast conversion vs. a slow, hesitant one might mean different things for UX)</w:t>
+      </w:r>
+    </w:p>
+    <w:p>
+      <w:pPr>
+        <w:ind w:left="360"/>
+        <w:jc w:val="both"/>
+      </w:pPr>
+      <w:r>
+        <w:rPr>
+          <w:b/>
+          <w:bCs/>
+        </w:rPr>
+        <w:t>Cross-session (customer-level, not session-level)</w:t>
+      </w:r>
+    </w:p>
+    <w:p>
+      <w:pPr>
+        <w:pStyle w:val="ListParagraph"/>
+        <w:numPr>
+          <w:ilvl w:val="0"/>
+          <w:numId w:val="14"/>
+        </w:numPr>
+        <w:jc w:val="both"/>
+      </w:pPr>
+      <w:r>
+        <w:t>How many sessions does a customer have before their first successful order? (</w:t>
+      </w:r>
+      <w:proofErr w:type="gramStart"/>
+      <w:r>
+        <w:t>new</w:t>
+      </w:r>
+      <w:proofErr w:type="gramEnd"/>
+      <w:r>
+        <w:t xml:space="preserve"> </w:t>
+      </w:r>
+      <w:r>
+        <w:t>-</w:t>
+      </w:r>
+      <w:r>
+        <w:t xml:space="preserve"> this is actually a project-1-style question, similar to customer lifecycle/RFM thinking you already did for fact_customer_segment_snapshot </w:t>
+      </w:r>
+      <w:r>
+        <w:t>-</w:t>
+      </w:r>
+      <w:r>
+        <w:t xml:space="preserve"> first-touch-to-conversion is a classic acquisition metric)</w:t>
+      </w:r>
+    </w:p>
+    <w:p>
+      <w:pPr>
+        <w:ind w:left="360"/>
         <w:jc w:val="both"/>
       </w:pPr>
     </w:p>
@@ -856,7 +1172,7 @@
 </file>
 
 <file path=word/numbering.xml><?xml version="1.0" encoding="utf-8"?>
-<w:numbering xmlns:wpc="http://schemas.microsoft.com/office/word/2010/wordprocessingCanvas" xmlns:cx="http://schemas.microsoft.com/office/drawing/2014/chartex" xmlns:cx1="http://schemas.microsoft.com/office/drawing/2015/9/8/chartex" xmlns:cx2="http://schemas.microsoft.com/office/drawing/2015/10/21/chartex" xmlns:cx3="http://schemas.microsoft.com/office/drawing/2016/5/9/chartex" xmlns:cx4="http://schemas.microsoft.com/office/drawing/2016/5/10/chartex" xmlns:cx5="http://schemas.microsoft.com/office/drawing/2016/5/11/chartex" xmlns:cx6="http://schemas.microsoft.com/office/drawing/2016/5/12/chartex" xmlns:cx7="http://schemas.microsoft.com/office/drawing/2016/5/13/chartex" xmlns:cx8="http://schemas.microsoft.com/office/drawing/2016/5/14/chartex" xmlns:mc="http://schemas.openxmlformats.org/markup-compatibility/2006" xmlns:aink="http://schemas.microsoft.com/office/drawing/2016/ink" xmlns:am3d="http://schemas.microsoft.com/office/drawing/2017/model3d" xmlns:o="urn:schemas-microsoft-com:office:office" xmlns:oel="http://schemas.microsoft.com/office/2019/extlst" xmlns:r="http://schemas.openxmlformats.org/officeDocument/2006/relationships" xmlns:m="http://schemas.openxmlformats.org/officeDocument/2006/math" xmlns:v="urn:schemas-microsoft-com:vml" xmlns:wp14="http://schemas.microsoft.com/office/word/2010/wordprocessingDrawing" xmlns:wp="http://schemas.openxmlformats.org/drawingml/2006/wordprocessingDrawing" xmlns:w10="urn:schemas-microsoft-com:office:word" xmlns:w="http://schemas.openxmlformats.org/wordprocessingml/2006/main" xmlns:w14="http://schemas.microsoft.com/office/word/2010/wordml" xmlns:w15="http://schemas.microsoft.com/office/word/2012/wordml" xmlns:w16cei="http://schemas.microsoft.com/office/word/2026/wordml/cei" xmlns:w16cex="http://schemas.microsoft.com/office/word/2018/wordml/cex" xmlns:w16cid="http://schemas.microsoft.com/office/word/2016/wordml/cid" xmlns:w16="http://schemas.microsoft.com/office/word/2018/wordml" xmlns:w16du="http://schemas.microsoft.com/office/word/2023/wordml/word16du" xmlns:w16sdtdh="http://schemas.microsoft.com/office/word/2020/wordml/sdtdatahash" xmlns:w16sdtfl="http://schemas.microsoft.com/office/word/2024/wordml/sdtformatlock" xmlns:w16se="http://schemas.microsoft.com/office/word/2015/wordml/symex" xmlns:wpg="http://schemas.microsoft.com/office/word/2010/wordprocessingGroup" xmlns:wpi="http://schemas.microsoft.com/office/word/2010/wordprocessingInk" xmlns:wne="http://schemas.microsoft.com/office/word/2006/wordml" xmlns:wps="http://schemas.microsoft.com/office/word/2010/wordprocessingShape" mc:Ignorable="w14 w15 w16se w16cid w16 w16cex w16sdtdh w16sdtfl w16du wp14">
+<w:numbering xmlns:wpc="http://schemas.microsoft.com/office/word/2010/wordprocessingCanvas" xmlns:cx="http://schemas.microsoft.com/office/drawing/2014/chartex" xmlns:cx1="http://schemas.microsoft.com/office/drawing/2015/9/8/chartex" xmlns:cx2="http://schemas.microsoft.com/office/drawing/2015/10/21/chartex" xmlns:cx3="http://schemas.microsoft.com/office/drawing/2016/5/9/chartex" xmlns:cx4="http://schemas.microsoft.com/office/drawing/2016/5/10/chartex" xmlns:cx5="http://schemas.microsoft.com/office/drawing/2016/5/11/chartex" xmlns:cx6="http://schemas.microsoft.com/office/drawing/2016/5/12/chartex" xmlns:cx7="http://schemas.microsoft.com/office/drawing/2016/5/13/chartex" xmlns:cx8="http://schemas.microsoft.com/office/drawing/2016/5/14/chartex" xmlns:mc="http://schemas.openxmlformats.org/markup-compatibility/2006" xmlns:aink="http://schemas.microsoft.com/office/drawing/2016/ink" xmlns:am3d="http://schemas.microsoft.com/office/drawing/2017/model3d" xmlns:o="urn:schemas-microsoft-com:office:office" xmlns:r="http://schemas.openxmlformats.org/officeDocument/2006/relationships" xmlns:m="http://schemas.openxmlformats.org/officeDocument/2006/math" xmlns:v="urn:schemas-microsoft-com:vml" xmlns:wp14="http://schemas.microsoft.com/office/word/2010/wordprocessingDrawing" xmlns:wp="http://schemas.openxmlformats.org/drawingml/2006/wordprocessingDrawing" xmlns:w10="urn:schemas-microsoft-com:office:word" xmlns:w="http://schemas.openxmlformats.org/wordprocessingml/2006/main" xmlns:w14="http://schemas.microsoft.com/office/word/2010/wordml" xmlns:w15="http://schemas.microsoft.com/office/word/2012/wordml" xmlns:w16cex="http://schemas.microsoft.com/office/word/2018/wordml/cex" xmlns:w16cid="http://schemas.microsoft.com/office/word/2016/wordml/cid" xmlns:w16="http://schemas.microsoft.com/office/word/2018/wordml" xmlns:w16sdtdh="http://schemas.microsoft.com/office/word/2020/wordml/sdtdatahash" xmlns:w16se="http://schemas.microsoft.com/office/word/2015/wordml/symex" xmlns:wpg="http://schemas.microsoft.com/office/word/2010/wordprocessingGroup" xmlns:wpi="http://schemas.microsoft.com/office/word/2010/wordprocessingInk" xmlns:wne="http://schemas.microsoft.com/office/word/2006/wordml" xmlns:wps="http://schemas.microsoft.com/office/word/2010/wordprocessingShape" mc:Ignorable="w14 w15 w16se w16cid w16 w16cex w16sdtdh wp14">
   <w:abstractNum w:abstractNumId="0" w15:restartNumberingAfterBreak="0">
     <w:nsid w:val="005A197A"/>
     <w:multiLevelType w:val="multilevel"/>
@@ -1084,6 +1400,264 @@
     </w:lvl>
   </w:abstractNum>
   <w:abstractNum w:abstractNumId="2" w15:restartNumberingAfterBreak="0">
+    <w:nsid w:val="20E81D08"/>
+    <w:multiLevelType w:val="hybridMultilevel"/>
+    <w:tmpl w:val="08200D7C"/>
+    <w:lvl w:ilvl="0" w:tplc="4009000F">
+      <w:start w:val="1"/>
+      <w:numFmt w:val="decimal"/>
+      <w:lvlText w:val="%1."/>
+      <w:lvlJc w:val="left"/>
+      <w:pPr>
+        <w:ind w:left="1080" w:hanging="360"/>
+      </w:pPr>
+    </w:lvl>
+    <w:lvl w:ilvl="1" w:tplc="40090019" w:tentative="1">
+      <w:start w:val="1"/>
+      <w:numFmt w:val="lowerLetter"/>
+      <w:lvlText w:val="%2."/>
+      <w:lvlJc w:val="left"/>
+      <w:pPr>
+        <w:ind w:left="1800" w:hanging="360"/>
+      </w:pPr>
+    </w:lvl>
+    <w:lvl w:ilvl="2" w:tplc="4009001B" w:tentative="1">
+      <w:start w:val="1"/>
+      <w:numFmt w:val="lowerRoman"/>
+      <w:lvlText w:val="%3."/>
+      <w:lvlJc w:val="right"/>
+      <w:pPr>
+        <w:ind w:left="2520" w:hanging="180"/>
+      </w:pPr>
+    </w:lvl>
+    <w:lvl w:ilvl="3" w:tplc="4009000F" w:tentative="1">
+      <w:start w:val="1"/>
+      <w:numFmt w:val="decimal"/>
+      <w:lvlText w:val="%4."/>
+      <w:lvlJc w:val="left"/>
+      <w:pPr>
+        <w:ind w:left="3240" w:hanging="360"/>
+      </w:pPr>
+    </w:lvl>
+    <w:lvl w:ilvl="4" w:tplc="40090019" w:tentative="1">
+      <w:start w:val="1"/>
+      <w:numFmt w:val="lowerLetter"/>
+      <w:lvlText w:val="%5."/>
+      <w:lvlJc w:val="left"/>
+      <w:pPr>
+        <w:ind w:left="3960" w:hanging="360"/>
+      </w:pPr>
+    </w:lvl>
+    <w:lvl w:ilvl="5" w:tplc="4009001B" w:tentative="1">
+      <w:start w:val="1"/>
+      <w:numFmt w:val="lowerRoman"/>
+      <w:lvlText w:val="%6."/>
+      <w:lvlJc w:val="right"/>
+      <w:pPr>
+        <w:ind w:left="4680" w:hanging="180"/>
+      </w:pPr>
+    </w:lvl>
+    <w:lvl w:ilvl="6" w:tplc="4009000F" w:tentative="1">
+      <w:start w:val="1"/>
+      <w:numFmt w:val="decimal"/>
+      <w:lvlText w:val="%7."/>
+      <w:lvlJc w:val="left"/>
+      <w:pPr>
+        <w:ind w:left="5400" w:hanging="360"/>
+      </w:pPr>
+    </w:lvl>
+    <w:lvl w:ilvl="7" w:tplc="40090019" w:tentative="1">
+      <w:start w:val="1"/>
+      <w:numFmt w:val="lowerLetter"/>
+      <w:lvlText w:val="%8."/>
+      <w:lvlJc w:val="left"/>
+      <w:pPr>
+        <w:ind w:left="6120" w:hanging="360"/>
+      </w:pPr>
+    </w:lvl>
+    <w:lvl w:ilvl="8" w:tplc="4009001B" w:tentative="1">
+      <w:start w:val="1"/>
+      <w:numFmt w:val="lowerRoman"/>
+      <w:lvlText w:val="%9."/>
+      <w:lvlJc w:val="right"/>
+      <w:pPr>
+        <w:ind w:left="6840" w:hanging="180"/>
+      </w:pPr>
+    </w:lvl>
+  </w:abstractNum>
+  <w:abstractNum w:abstractNumId="3" w15:restartNumberingAfterBreak="0">
+    <w:nsid w:val="290733D8"/>
+    <w:multiLevelType w:val="hybridMultilevel"/>
+    <w:tmpl w:val="2208F84C"/>
+    <w:lvl w:ilvl="0" w:tplc="4009000F">
+      <w:start w:val="1"/>
+      <w:numFmt w:val="decimal"/>
+      <w:lvlText w:val="%1."/>
+      <w:lvlJc w:val="left"/>
+      <w:pPr>
+        <w:ind w:left="720" w:hanging="360"/>
+      </w:pPr>
+    </w:lvl>
+    <w:lvl w:ilvl="1" w:tplc="40090019" w:tentative="1">
+      <w:start w:val="1"/>
+      <w:numFmt w:val="lowerLetter"/>
+      <w:lvlText w:val="%2."/>
+      <w:lvlJc w:val="left"/>
+      <w:pPr>
+        <w:ind w:left="1440" w:hanging="360"/>
+      </w:pPr>
+    </w:lvl>
+    <w:lvl w:ilvl="2" w:tplc="4009001B" w:tentative="1">
+      <w:start w:val="1"/>
+      <w:numFmt w:val="lowerRoman"/>
+      <w:lvlText w:val="%3."/>
+      <w:lvlJc w:val="right"/>
+      <w:pPr>
+        <w:ind w:left="2160" w:hanging="180"/>
+      </w:pPr>
+    </w:lvl>
+    <w:lvl w:ilvl="3" w:tplc="4009000F" w:tentative="1">
+      <w:start w:val="1"/>
+      <w:numFmt w:val="decimal"/>
+      <w:lvlText w:val="%4."/>
+      <w:lvlJc w:val="left"/>
+      <w:pPr>
+        <w:ind w:left="2880" w:hanging="360"/>
+      </w:pPr>
+    </w:lvl>
+    <w:lvl w:ilvl="4" w:tplc="40090019" w:tentative="1">
+      <w:start w:val="1"/>
+      <w:numFmt w:val="lowerLetter"/>
+      <w:lvlText w:val="%5."/>
+      <w:lvlJc w:val="left"/>
+      <w:pPr>
+        <w:ind w:left="3600" w:hanging="360"/>
+      </w:pPr>
+    </w:lvl>
+    <w:lvl w:ilvl="5" w:tplc="4009001B" w:tentative="1">
+      <w:start w:val="1"/>
+      <w:numFmt w:val="lowerRoman"/>
+      <w:lvlText w:val="%6."/>
+      <w:lvlJc w:val="right"/>
+      <w:pPr>
+        <w:ind w:left="4320" w:hanging="180"/>
+      </w:pPr>
+    </w:lvl>
+    <w:lvl w:ilvl="6" w:tplc="4009000F" w:tentative="1">
+      <w:start w:val="1"/>
+      <w:numFmt w:val="decimal"/>
+      <w:lvlText w:val="%7."/>
+      <w:lvlJc w:val="left"/>
+      <w:pPr>
+        <w:ind w:left="5040" w:hanging="360"/>
+      </w:pPr>
+    </w:lvl>
+    <w:lvl w:ilvl="7" w:tplc="40090019" w:tentative="1">
+      <w:start w:val="1"/>
+      <w:numFmt w:val="lowerLetter"/>
+      <w:lvlText w:val="%8."/>
+      <w:lvlJc w:val="left"/>
+      <w:pPr>
+        <w:ind w:left="5760" w:hanging="360"/>
+      </w:pPr>
+    </w:lvl>
+    <w:lvl w:ilvl="8" w:tplc="4009001B" w:tentative="1">
+      <w:start w:val="1"/>
+      <w:numFmt w:val="lowerRoman"/>
+      <w:lvlText w:val="%9."/>
+      <w:lvlJc w:val="right"/>
+      <w:pPr>
+        <w:ind w:left="6480" w:hanging="180"/>
+      </w:pPr>
+    </w:lvl>
+  </w:abstractNum>
+  <w:abstractNum w:abstractNumId="4" w15:restartNumberingAfterBreak="0">
+    <w:nsid w:val="29F01B9C"/>
+    <w:multiLevelType w:val="hybridMultilevel"/>
+    <w:tmpl w:val="CF8808F0"/>
+    <w:lvl w:ilvl="0" w:tplc="4009000F">
+      <w:start w:val="1"/>
+      <w:numFmt w:val="decimal"/>
+      <w:lvlText w:val="%1."/>
+      <w:lvlJc w:val="left"/>
+      <w:pPr>
+        <w:ind w:left="720" w:hanging="360"/>
+      </w:pPr>
+    </w:lvl>
+    <w:lvl w:ilvl="1" w:tplc="40090019" w:tentative="1">
+      <w:start w:val="1"/>
+      <w:numFmt w:val="lowerLetter"/>
+      <w:lvlText w:val="%2."/>
+      <w:lvlJc w:val="left"/>
+      <w:pPr>
+        <w:ind w:left="1440" w:hanging="360"/>
+      </w:pPr>
+    </w:lvl>
+    <w:lvl w:ilvl="2" w:tplc="4009001B" w:tentative="1">
+      <w:start w:val="1"/>
+      <w:numFmt w:val="lowerRoman"/>
+      <w:lvlText w:val="%3."/>
+      <w:lvlJc w:val="right"/>
+      <w:pPr>
+        <w:ind w:left="2160" w:hanging="180"/>
+      </w:pPr>
+    </w:lvl>
+    <w:lvl w:ilvl="3" w:tplc="4009000F" w:tentative="1">
+      <w:start w:val="1"/>
+      <w:numFmt w:val="decimal"/>
+      <w:lvlText w:val="%4."/>
+      <w:lvlJc w:val="left"/>
+      <w:pPr>
+        <w:ind w:left="2880" w:hanging="360"/>
+      </w:pPr>
+    </w:lvl>
+    <w:lvl w:ilvl="4" w:tplc="40090019" w:tentative="1">
+      <w:start w:val="1"/>
+      <w:numFmt w:val="lowerLetter"/>
+      <w:lvlText w:val="%5."/>
+      <w:lvlJc w:val="left"/>
+      <w:pPr>
+        <w:ind w:left="3600" w:hanging="360"/>
+      </w:pPr>
+    </w:lvl>
+    <w:lvl w:ilvl="5" w:tplc="4009001B" w:tentative="1">
+      <w:start w:val="1"/>
+      <w:numFmt w:val="lowerRoman"/>
+      <w:lvlText w:val="%6."/>
+      <w:lvlJc w:val="right"/>
+      <w:pPr>
+        <w:ind w:left="4320" w:hanging="180"/>
+      </w:pPr>
+    </w:lvl>
+    <w:lvl w:ilvl="6" w:tplc="4009000F" w:tentative="1">
+      <w:start w:val="1"/>
+      <w:numFmt w:val="decimal"/>
+      <w:lvlText w:val="%7."/>
+      <w:lvlJc w:val="left"/>
+      <w:pPr>
+        <w:ind w:left="5040" w:hanging="360"/>
+      </w:pPr>
+    </w:lvl>
+    <w:lvl w:ilvl="7" w:tplc="40090019" w:tentative="1">
+      <w:start w:val="1"/>
+      <w:numFmt w:val="lowerLetter"/>
+      <w:lvlText w:val="%8."/>
+      <w:lvlJc w:val="left"/>
+      <w:pPr>
+        <w:ind w:left="5760" w:hanging="360"/>
+      </w:pPr>
+    </w:lvl>
+    <w:lvl w:ilvl="8" w:tplc="4009001B" w:tentative="1">
+      <w:start w:val="1"/>
+      <w:numFmt w:val="lowerRoman"/>
+      <w:lvlText w:val="%9."/>
+      <w:lvlJc w:val="right"/>
+      <w:pPr>
+        <w:ind w:left="6480" w:hanging="180"/>
+      </w:pPr>
+    </w:lvl>
+  </w:abstractNum>
+  <w:abstractNum w:abstractNumId="5" w15:restartNumberingAfterBreak="0">
     <w:nsid w:val="2A9E25F4"/>
     <w:multiLevelType w:val="hybridMultilevel"/>
     <w:tmpl w:val="70F866D4"/>
@@ -1169,7 +1743,7 @@
       </w:pPr>
     </w:lvl>
   </w:abstractNum>
-  <w:abstractNum w:abstractNumId="3" w15:restartNumberingAfterBreak="0">
+  <w:abstractNum w:abstractNumId="6" w15:restartNumberingAfterBreak="0">
     <w:nsid w:val="3BE033EF"/>
     <w:multiLevelType w:val="hybridMultilevel"/>
     <w:tmpl w:val="271E22F4"/>
@@ -1258,7 +1832,93 @@
       </w:pPr>
     </w:lvl>
   </w:abstractNum>
-  <w:abstractNum w:abstractNumId="4" w15:restartNumberingAfterBreak="0">
+  <w:abstractNum w:abstractNumId="7" w15:restartNumberingAfterBreak="0">
+    <w:nsid w:val="4DB27805"/>
+    <w:multiLevelType w:val="hybridMultilevel"/>
+    <w:tmpl w:val="7248CEB6"/>
+    <w:lvl w:ilvl="0" w:tplc="4009000F">
+      <w:start w:val="1"/>
+      <w:numFmt w:val="decimal"/>
+      <w:lvlText w:val="%1."/>
+      <w:lvlJc w:val="left"/>
+      <w:pPr>
+        <w:ind w:left="1080" w:hanging="360"/>
+      </w:pPr>
+    </w:lvl>
+    <w:lvl w:ilvl="1" w:tplc="40090019" w:tentative="1">
+      <w:start w:val="1"/>
+      <w:numFmt w:val="lowerLetter"/>
+      <w:lvlText w:val="%2."/>
+      <w:lvlJc w:val="left"/>
+      <w:pPr>
+        <w:ind w:left="1800" w:hanging="360"/>
+      </w:pPr>
+    </w:lvl>
+    <w:lvl w:ilvl="2" w:tplc="4009001B" w:tentative="1">
+      <w:start w:val="1"/>
+      <w:numFmt w:val="lowerRoman"/>
+      <w:lvlText w:val="%3."/>
+      <w:lvlJc w:val="right"/>
+      <w:pPr>
+        <w:ind w:left="2520" w:hanging="180"/>
+      </w:pPr>
+    </w:lvl>
+    <w:lvl w:ilvl="3" w:tplc="4009000F" w:tentative="1">
+      <w:start w:val="1"/>
+      <w:numFmt w:val="decimal"/>
+      <w:lvlText w:val="%4."/>
+      <w:lvlJc w:val="left"/>
+      <w:pPr>
+        <w:ind w:left="3240" w:hanging="360"/>
+      </w:pPr>
+    </w:lvl>
+    <w:lvl w:ilvl="4" w:tplc="40090019" w:tentative="1">
+      <w:start w:val="1"/>
+      <w:numFmt w:val="lowerLetter"/>
+      <w:lvlText w:val="%5."/>
+      <w:lvlJc w:val="left"/>
+      <w:pPr>
+        <w:ind w:left="3960" w:hanging="360"/>
+      </w:pPr>
+    </w:lvl>
+    <w:lvl w:ilvl="5" w:tplc="4009001B" w:tentative="1">
+      <w:start w:val="1"/>
+      <w:numFmt w:val="lowerRoman"/>
+      <w:lvlText w:val="%6."/>
+      <w:lvlJc w:val="right"/>
+      <w:pPr>
+        <w:ind w:left="4680" w:hanging="180"/>
+      </w:pPr>
+    </w:lvl>
+    <w:lvl w:ilvl="6" w:tplc="4009000F" w:tentative="1">
+      <w:start w:val="1"/>
+      <w:numFmt w:val="decimal"/>
+      <w:lvlText w:val="%7."/>
+      <w:lvlJc w:val="left"/>
+      <w:pPr>
+        <w:ind w:left="5400" w:hanging="360"/>
+      </w:pPr>
+    </w:lvl>
+    <w:lvl w:ilvl="7" w:tplc="40090019" w:tentative="1">
+      <w:start w:val="1"/>
+      <w:numFmt w:val="lowerLetter"/>
+      <w:lvlText w:val="%8."/>
+      <w:lvlJc w:val="left"/>
+      <w:pPr>
+        <w:ind w:left="6120" w:hanging="360"/>
+      </w:pPr>
+    </w:lvl>
+    <w:lvl w:ilvl="8" w:tplc="4009001B" w:tentative="1">
+      <w:start w:val="1"/>
+      <w:numFmt w:val="lowerRoman"/>
+      <w:lvlText w:val="%9."/>
+      <w:lvlJc w:val="right"/>
+      <w:pPr>
+        <w:ind w:left="6840" w:hanging="180"/>
+      </w:pPr>
+    </w:lvl>
+  </w:abstractNum>
+  <w:abstractNum w:abstractNumId="8" w15:restartNumberingAfterBreak="0">
     <w:nsid w:val="50156E0D"/>
     <w:multiLevelType w:val="multilevel"/>
     <w:tmpl w:val="835CE25C"/>
@@ -1371,7 +2031,7 @@
       </w:pPr>
     </w:lvl>
   </w:abstractNum>
-  <w:abstractNum w:abstractNumId="5" w15:restartNumberingAfterBreak="0">
+  <w:abstractNum w:abstractNumId="9" w15:restartNumberingAfterBreak="0">
     <w:nsid w:val="54160B7E"/>
     <w:multiLevelType w:val="hybridMultilevel"/>
     <w:tmpl w:val="34BEA7DE"/>
@@ -1457,7 +2117,7 @@
       </w:pPr>
     </w:lvl>
   </w:abstractNum>
-  <w:abstractNum w:abstractNumId="6" w15:restartNumberingAfterBreak="0">
+  <w:abstractNum w:abstractNumId="10" w15:restartNumberingAfterBreak="0">
     <w:nsid w:val="56AE1A4E"/>
     <w:multiLevelType w:val="hybridMultilevel"/>
     <w:tmpl w:val="BA5A7E64"/>
@@ -1543,7 +2203,7 @@
       </w:pPr>
     </w:lvl>
   </w:abstractNum>
-  <w:abstractNum w:abstractNumId="7" w15:restartNumberingAfterBreak="0">
+  <w:abstractNum w:abstractNumId="11" w15:restartNumberingAfterBreak="0">
     <w:nsid w:val="5CF32ABC"/>
     <w:multiLevelType w:val="multilevel"/>
     <w:tmpl w:val="835CE25C"/>
@@ -1656,7 +2316,7 @@
       </w:pPr>
     </w:lvl>
   </w:abstractNum>
-  <w:abstractNum w:abstractNumId="8" w15:restartNumberingAfterBreak="0">
+  <w:abstractNum w:abstractNumId="12" w15:restartNumberingAfterBreak="0">
     <w:nsid w:val="626A490C"/>
     <w:multiLevelType w:val="hybridMultilevel"/>
     <w:tmpl w:val="1A2A10C2"/>
@@ -1742,7 +2402,7 @@
       </w:pPr>
     </w:lvl>
   </w:abstractNum>
-  <w:abstractNum w:abstractNumId="9" w15:restartNumberingAfterBreak="0">
+  <w:abstractNum w:abstractNumId="13" w15:restartNumberingAfterBreak="0">
     <w:nsid w:val="668F56E2"/>
     <w:multiLevelType w:val="multilevel"/>
     <w:tmpl w:val="DA709A7E"/>
@@ -1855,7 +2515,7 @@
       </w:pPr>
     </w:lvl>
   </w:abstractNum>
-  <w:abstractNum w:abstractNumId="10" w15:restartNumberingAfterBreak="0">
+  <w:abstractNum w:abstractNumId="14" w15:restartNumberingAfterBreak="0">
     <w:nsid w:val="693A2E69"/>
     <w:multiLevelType w:val="hybridMultilevel"/>
     <w:tmpl w:val="8182F22E"/>
@@ -1941,7 +2601,120 @@
       </w:pPr>
     </w:lvl>
   </w:abstractNum>
-  <w:abstractNum w:abstractNumId="11" w15:restartNumberingAfterBreak="0">
+  <w:abstractNum w:abstractNumId="15" w15:restartNumberingAfterBreak="0">
+    <w:nsid w:val="6CE3132F"/>
+    <w:multiLevelType w:val="multilevel"/>
+    <w:tmpl w:val="3A622FC8"/>
+    <w:lvl w:ilvl="0">
+      <w:start w:val="1"/>
+      <w:numFmt w:val="decimal"/>
+      <w:lvlText w:val="%1."/>
+      <w:lvlJc w:val="left"/>
+      <w:pPr>
+        <w:tabs>
+          <w:tab w:val="num" w:pos="720"/>
+        </w:tabs>
+        <w:ind w:left="720" w:hanging="360"/>
+      </w:pPr>
+    </w:lvl>
+    <w:lvl w:ilvl="1" w:tentative="1">
+      <w:start w:val="1"/>
+      <w:numFmt w:val="decimal"/>
+      <w:lvlText w:val="%2."/>
+      <w:lvlJc w:val="left"/>
+      <w:pPr>
+        <w:tabs>
+          <w:tab w:val="num" w:pos="1440"/>
+        </w:tabs>
+        <w:ind w:left="1440" w:hanging="360"/>
+      </w:pPr>
+    </w:lvl>
+    <w:lvl w:ilvl="2" w:tentative="1">
+      <w:start w:val="1"/>
+      <w:numFmt w:val="decimal"/>
+      <w:lvlText w:val="%3."/>
+      <w:lvlJc w:val="left"/>
+      <w:pPr>
+        <w:tabs>
+          <w:tab w:val="num" w:pos="2160"/>
+        </w:tabs>
+        <w:ind w:left="2160" w:hanging="360"/>
+      </w:pPr>
+    </w:lvl>
+    <w:lvl w:ilvl="3" w:tentative="1">
+      <w:start w:val="1"/>
+      <w:numFmt w:val="decimal"/>
+      <w:lvlText w:val="%4."/>
+      <w:lvlJc w:val="left"/>
+      <w:pPr>
+        <w:tabs>
+          <w:tab w:val="num" w:pos="2880"/>
+        </w:tabs>
+        <w:ind w:left="2880" w:hanging="360"/>
+      </w:pPr>
+    </w:lvl>
+    <w:lvl w:ilvl="4" w:tentative="1">
+      <w:start w:val="1"/>
+      <w:numFmt w:val="decimal"/>
+      <w:lvlText w:val="%5."/>
+      <w:lvlJc w:val="left"/>
+      <w:pPr>
+        <w:tabs>
+          <w:tab w:val="num" w:pos="3600"/>
+        </w:tabs>
+        <w:ind w:left="3600" w:hanging="360"/>
+      </w:pPr>
+    </w:lvl>
+    <w:lvl w:ilvl="5" w:tentative="1">
+      <w:start w:val="1"/>
+      <w:numFmt w:val="decimal"/>
+      <w:lvlText w:val="%6."/>
+      <w:lvlJc w:val="left"/>
+      <w:pPr>
+        <w:tabs>
+          <w:tab w:val="num" w:pos="4320"/>
+        </w:tabs>
+        <w:ind w:left="4320" w:hanging="360"/>
+      </w:pPr>
+    </w:lvl>
+    <w:lvl w:ilvl="6" w:tentative="1">
+      <w:start w:val="1"/>
+      <w:numFmt w:val="decimal"/>
+      <w:lvlText w:val="%7."/>
+      <w:lvlJc w:val="left"/>
+      <w:pPr>
+        <w:tabs>
+          <w:tab w:val="num" w:pos="5040"/>
+        </w:tabs>
+        <w:ind w:left="5040" w:hanging="360"/>
+      </w:pPr>
+    </w:lvl>
+    <w:lvl w:ilvl="7" w:tentative="1">
+      <w:start w:val="1"/>
+      <w:numFmt w:val="decimal"/>
+      <w:lvlText w:val="%8."/>
+      <w:lvlJc w:val="left"/>
+      <w:pPr>
+        <w:tabs>
+          <w:tab w:val="num" w:pos="5760"/>
+        </w:tabs>
+        <w:ind w:left="5760" w:hanging="360"/>
+      </w:pPr>
+    </w:lvl>
+    <w:lvl w:ilvl="8" w:tentative="1">
+      <w:start w:val="1"/>
+      <w:numFmt w:val="decimal"/>
+      <w:lvlText w:val="%9."/>
+      <w:lvlJc w:val="left"/>
+      <w:pPr>
+        <w:tabs>
+          <w:tab w:val="num" w:pos="6480"/>
+        </w:tabs>
+        <w:ind w:left="6480" w:hanging="360"/>
+      </w:pPr>
+    </w:lvl>
+  </w:abstractNum>
+  <w:abstractNum w:abstractNumId="16" w15:restartNumberingAfterBreak="0">
     <w:nsid w:val="769D273E"/>
     <w:multiLevelType w:val="hybridMultilevel"/>
     <w:tmpl w:val="7CB8FF32"/>
@@ -2027,47 +2800,151 @@
       </w:pPr>
     </w:lvl>
   </w:abstractNum>
-  <w:num w:numId="1" w16cid:durableId="991525548">
+  <w:abstractNum w:abstractNumId="17" w15:restartNumberingAfterBreak="0">
+    <w:nsid w:val="777D4911"/>
+    <w:multiLevelType w:val="hybridMultilevel"/>
+    <w:tmpl w:val="9D509DA6"/>
+    <w:lvl w:ilvl="0" w:tplc="4009000F">
+      <w:start w:val="1"/>
+      <w:numFmt w:val="decimal"/>
+      <w:lvlText w:val="%1."/>
+      <w:lvlJc w:val="left"/>
+      <w:pPr>
+        <w:ind w:left="1080" w:hanging="360"/>
+      </w:pPr>
+    </w:lvl>
+    <w:lvl w:ilvl="1" w:tplc="40090019" w:tentative="1">
+      <w:start w:val="1"/>
+      <w:numFmt w:val="lowerLetter"/>
+      <w:lvlText w:val="%2."/>
+      <w:lvlJc w:val="left"/>
+      <w:pPr>
+        <w:ind w:left="1800" w:hanging="360"/>
+      </w:pPr>
+    </w:lvl>
+    <w:lvl w:ilvl="2" w:tplc="4009001B" w:tentative="1">
+      <w:start w:val="1"/>
+      <w:numFmt w:val="lowerRoman"/>
+      <w:lvlText w:val="%3."/>
+      <w:lvlJc w:val="right"/>
+      <w:pPr>
+        <w:ind w:left="2520" w:hanging="180"/>
+      </w:pPr>
+    </w:lvl>
+    <w:lvl w:ilvl="3" w:tplc="4009000F" w:tentative="1">
+      <w:start w:val="1"/>
+      <w:numFmt w:val="decimal"/>
+      <w:lvlText w:val="%4."/>
+      <w:lvlJc w:val="left"/>
+      <w:pPr>
+        <w:ind w:left="3240" w:hanging="360"/>
+      </w:pPr>
+    </w:lvl>
+    <w:lvl w:ilvl="4" w:tplc="40090019" w:tentative="1">
+      <w:start w:val="1"/>
+      <w:numFmt w:val="lowerLetter"/>
+      <w:lvlText w:val="%5."/>
+      <w:lvlJc w:val="left"/>
+      <w:pPr>
+        <w:ind w:left="3960" w:hanging="360"/>
+      </w:pPr>
+    </w:lvl>
+    <w:lvl w:ilvl="5" w:tplc="4009001B" w:tentative="1">
+      <w:start w:val="1"/>
+      <w:numFmt w:val="lowerRoman"/>
+      <w:lvlText w:val="%6."/>
+      <w:lvlJc w:val="right"/>
+      <w:pPr>
+        <w:ind w:left="4680" w:hanging="180"/>
+      </w:pPr>
+    </w:lvl>
+    <w:lvl w:ilvl="6" w:tplc="4009000F" w:tentative="1">
+      <w:start w:val="1"/>
+      <w:numFmt w:val="decimal"/>
+      <w:lvlText w:val="%7."/>
+      <w:lvlJc w:val="left"/>
+      <w:pPr>
+        <w:ind w:left="5400" w:hanging="360"/>
+      </w:pPr>
+    </w:lvl>
+    <w:lvl w:ilvl="7" w:tplc="40090019" w:tentative="1">
+      <w:start w:val="1"/>
+      <w:numFmt w:val="lowerLetter"/>
+      <w:lvlText w:val="%8."/>
+      <w:lvlJc w:val="left"/>
+      <w:pPr>
+        <w:ind w:left="6120" w:hanging="360"/>
+      </w:pPr>
+    </w:lvl>
+    <w:lvl w:ilvl="8" w:tplc="4009001B" w:tentative="1">
+      <w:start w:val="1"/>
+      <w:numFmt w:val="lowerRoman"/>
+      <w:lvlText w:val="%9."/>
+      <w:lvlJc w:val="right"/>
+      <w:pPr>
+        <w:ind w:left="6840" w:hanging="180"/>
+      </w:pPr>
+    </w:lvl>
+  </w:abstractNum>
+  <w:num w:numId="1">
+    <w:abstractNumId w:val="8"/>
+  </w:num>
+  <w:num w:numId="2">
+    <w:abstractNumId w:val="10"/>
+  </w:num>
+  <w:num w:numId="3">
+    <w:abstractNumId w:val="0"/>
+  </w:num>
+  <w:num w:numId="4">
+    <w:abstractNumId w:val="1"/>
+  </w:num>
+  <w:num w:numId="5">
+    <w:abstractNumId w:val="11"/>
+  </w:num>
+  <w:num w:numId="6">
+    <w:abstractNumId w:val="13"/>
+  </w:num>
+  <w:num w:numId="7">
+    <w:abstractNumId w:val="14"/>
+  </w:num>
+  <w:num w:numId="8">
+    <w:abstractNumId w:val="6"/>
+  </w:num>
+  <w:num w:numId="9">
+    <w:abstractNumId w:val="9"/>
+  </w:num>
+  <w:num w:numId="10">
+    <w:abstractNumId w:val="12"/>
+  </w:num>
+  <w:num w:numId="11">
+    <w:abstractNumId w:val="5"/>
+  </w:num>
+  <w:num w:numId="12">
+    <w:abstractNumId w:val="16"/>
+  </w:num>
+  <w:num w:numId="13">
+    <w:abstractNumId w:val="15"/>
+  </w:num>
+  <w:num w:numId="14">
+    <w:abstractNumId w:val="7"/>
+  </w:num>
+  <w:num w:numId="15">
     <w:abstractNumId w:val="4"/>
   </w:num>
-  <w:num w:numId="2" w16cid:durableId="283197152">
-    <w:abstractNumId w:val="6"/>
-  </w:num>
-  <w:num w:numId="3" w16cid:durableId="1825312688">
-    <w:abstractNumId w:val="0"/>
-  </w:num>
-  <w:num w:numId="4" w16cid:durableId="858276311">
-    <w:abstractNumId w:val="1"/>
-  </w:num>
-  <w:num w:numId="5" w16cid:durableId="1108503257">
-    <w:abstractNumId w:val="7"/>
-  </w:num>
-  <w:num w:numId="6" w16cid:durableId="715934902">
-    <w:abstractNumId w:val="9"/>
-  </w:num>
-  <w:num w:numId="7" w16cid:durableId="2043743658">
-    <w:abstractNumId w:val="10"/>
-  </w:num>
-  <w:num w:numId="8" w16cid:durableId="2056002589">
-    <w:abstractNumId w:val="3"/>
-  </w:num>
-  <w:num w:numId="9" w16cid:durableId="516117865">
-    <w:abstractNumId w:val="5"/>
-  </w:num>
-  <w:num w:numId="10" w16cid:durableId="506988192">
-    <w:abstractNumId w:val="8"/>
-  </w:num>
-  <w:num w:numId="11" w16cid:durableId="24412126">
+  <w:num w:numId="16">
     <w:abstractNumId w:val="2"/>
   </w:num>
-  <w:num w:numId="12" w16cid:durableId="1211380128">
-    <w:abstractNumId w:val="11"/>
+  <w:num w:numId="17">
+    <w:abstractNumId w:val="17"/>
+  </w:num>
+  <w:num w:numId="18">
+    <w:abstractNumId w:val="3"/>
   </w:num>
 </w:numbering>
 </file>
 
 <file path=word/styles.xml><?xml version="1.0" encoding="utf-8"?>
-<w:styles xmlns:mc="http://schemas.openxmlformats.org/markup-compatibility/2006" xmlns:r="http://schemas.openxmlformats.org/officeDocument/2006/relationships" xmlns:w="http://schemas.openxmlformats.org/wordprocessingml/2006/main" xmlns:w14="http://schemas.microsoft.com/office/word/2010/wordml" xmlns:w15="http://schemas.microsoft.com/office/word/2012/wordml" xmlns:w16cex="http://schemas.microsoft.com/office/word/2018/wordml/cex" xmlns:w16cid="http://schemas.microsoft.com/office/word/2016/wordml/cid" xmlns:w16="http://schemas.microsoft.com/office/word/2018/wordml" xmlns:w16du="http://schemas.microsoft.com/office/word/2023/wordml/word16du" xmlns:w16sdtdh="http://schemas.microsoft.com/office/word/2020/wordml/sdtdatahash" xmlns:w16sdtfl="http://schemas.microsoft.com/office/word/2024/wordml/sdtformatlock" xmlns:w16se="http://schemas.microsoft.com/office/word/2015/wordml/symex" mc:Ignorable="w14 w15 w16se w16cid w16 w16cex w16sdtdh w16sdtfl w16du">
+<w:styles xmlns:mc="http://schemas.openxmlformats.org/markup-compatibility/2006" xmlns:r="http://schemas.openxmlformats.org/officeDocument/2006/relationships" xmlns:w="http://schemas.openxmlformats.org/wordprocessingml/2006/main" xmlns:w14="http://schemas.microsoft.com/office/word/2010/wordml" xmlns:w15="http://schemas.microsoft.com/office/word/2012/wordml" xmlns:w16cex="http://schemas.microsoft.com/office/word/2018/wordml/cex" xmlns:w16cid="http://schemas.microsoft.com/office/word/2016/wordml/cid" xmlns:w16="http://schemas.microsoft.com/office/word/2018/wordml" xmlns:w16sdtdh="http://schemas.microsoft.com/office/word/2020/wordml/sdtdatahash" xmlns:w16se="http://schemas.microsoft.com/office/word/2015/wordml/symex" mc:Ignorable="w14 w15 w16se w16cid w16 w16cex w16sdtdh">
   <w:docDefaults>
     <w:rPrDefault>
       <w:rPr>
@@ -2669,6 +3546,7 @@
   <w:style w:type="character" w:default="1" w:styleId="DefaultParagraphFont">
     <w:name w:val="Default Paragraph Font"/>
     <w:uiPriority w:val="1"/>
+    <w:semiHidden/>
     <w:unhideWhenUsed/>
   </w:style>
   <w:style w:type="table" w:default="1" w:styleId="TableNormal">
@@ -2980,6 +3858,59 @@
       <w:smallCaps/>
       <w:color w:val="0F4761" w:themeColor="accent1" w:themeShade="BF"/>
       <w:spacing w:val="5"/>
+    </w:rPr>
+  </w:style>
+  <w:style w:type="paragraph" w:styleId="NormalWeb">
+    <w:name w:val="Normal (Web)"/>
+    <w:basedOn w:val="Normal"/>
+    <w:uiPriority w:val="99"/>
+    <w:semiHidden/>
+    <w:unhideWhenUsed/>
+    <w:rsid w:val="00CF3A74"/>
+    <w:pPr>
+      <w:spacing w:before="100" w:beforeAutospacing="1" w:after="100" w:afterAutospacing="1" w:line="240" w:lineRule="auto"/>
+    </w:pPr>
+    <w:rPr>
+      <w:rFonts w:ascii="Times New Roman" w:eastAsia="Times New Roman" w:hAnsi="Times New Roman" w:cs="Times New Roman"/>
+      <w:kern w:val="0"/>
+      <w:szCs w:val="24"/>
+      <w:lang w:eastAsia="en-IN" w:bidi="ar-SA"/>
+      <w14:ligatures w14:val="none"/>
+    </w:rPr>
+  </w:style>
+  <w:style w:type="character" w:styleId="Strong">
+    <w:name w:val="Strong"/>
+    <w:basedOn w:val="DefaultParagraphFont"/>
+    <w:uiPriority w:val="22"/>
+    <w:qFormat/>
+    <w:rsid w:val="00CF3A74"/>
+    <w:rPr>
+      <w:b/>
+      <w:bCs/>
+    </w:rPr>
+  </w:style>
+  <w:style w:type="character" w:styleId="Emphasis">
+    <w:name w:val="Emphasis"/>
+    <w:basedOn w:val="DefaultParagraphFont"/>
+    <w:uiPriority w:val="20"/>
+    <w:qFormat/>
+    <w:rsid w:val="00CF3A74"/>
+    <w:rPr>
+      <w:i/>
+      <w:iCs/>
+    </w:rPr>
+  </w:style>
+  <w:style w:type="character" w:styleId="HTMLCode">
+    <w:name w:val="HTML Code"/>
+    <w:basedOn w:val="DefaultParagraphFont"/>
+    <w:uiPriority w:val="99"/>
+    <w:semiHidden/>
+    <w:unhideWhenUsed/>
+    <w:rsid w:val="00CF3A74"/>
+    <w:rPr>
+      <w:rFonts w:ascii="Courier New" w:eastAsia="Times New Roman" w:hAnsi="Courier New" w:cs="Courier New"/>
+      <w:sz w:val="20"/>
+      <w:szCs w:val="20"/>
     </w:rPr>
   </w:style>
 </w:styles>

</xml_diff>